<commit_message>
finish 4d rencana aksi
</commit_message>
<xml_diff>
--- a/aktualisasi/4d rencana aksi.docx
+++ b/aktualisasi/4d rencana aksi.docx
@@ -2,6 +2,2131 @@
 <file path=word/document.xml><?xml version="1.0" encoding="utf-8"?>
 <w:document xmlns:wpc="http://schemas.microsoft.com/office/word/2010/wordprocessingCanvas" xmlns:cx="http://schemas.microsoft.com/office/drawing/2014/chartex" xmlns:cx1="http://schemas.microsoft.com/office/drawing/2015/9/8/chartex" xmlns:cx2="http://schemas.microsoft.com/office/drawing/2015/10/21/chartex" xmlns:cx3="http://schemas.microsoft.com/office/drawing/2016/5/9/chartex" xmlns:cx4="http://schemas.microsoft.com/office/drawing/2016/5/10/chartex" xmlns:cx5="http://schemas.microsoft.com/office/drawing/2016/5/11/chartex" xmlns:cx6="http://schemas.microsoft.com/office/drawing/2016/5/12/chartex" xmlns:cx7="http://schemas.microsoft.com/office/drawing/2016/5/13/chartex" xmlns:cx8="http://schemas.microsoft.com/office/drawing/2016/5/14/chartex" xmlns:mc="http://schemas.openxmlformats.org/markup-compatibility/2006" xmlns:aink="http://schemas.microsoft.com/office/drawing/2016/ink" xmlns:am3d="http://schemas.microsoft.com/office/drawing/2017/model3d" xmlns:o="urn:schemas-microsoft-com:office:office" xmlns:oel="http://schemas.microsoft.com/office/2019/extlst" xmlns:r="http://schemas.openxmlformats.org/officeDocument/2006/relationships" xmlns:m="http://schemas.openxmlformats.org/officeDocument/2006/math" xmlns:v="urn:schemas-microsoft-com:vml" xmlns:wp14="http://schemas.microsoft.com/office/word/2010/wordprocessingDrawing" xmlns:wp="http://schemas.openxmlformats.org/drawingml/2006/wordprocessingDrawing" xmlns:w10="urn:schemas-microsoft-com:office:word" xmlns:w="http://schemas.openxmlformats.org/wordprocessingml/2006/main" xmlns:w14="http://schemas.microsoft.com/office/word/2010/wordml" xmlns:w15="http://schemas.microsoft.com/office/word/2012/wordml" xmlns:w16cex="http://schemas.microsoft.com/office/word/2018/wordml/cex" xmlns:w16cid="http://schemas.microsoft.com/office/word/2016/wordml/cid" xmlns:w16="http://schemas.microsoft.com/office/word/2018/wordml" xmlns:w16du="http://schemas.microsoft.com/office/word/2023/wordml/word16du" xmlns:w16sdtdh="http://schemas.microsoft.com/office/word/2020/wordml/sdtdatahash" xmlns:w16sdtfl="http://schemas.microsoft.com/office/word/2024/wordml/sdtformatlock" xmlns:w16se="http://schemas.microsoft.com/office/word/2015/wordml/symex" xmlns:wpg="http://schemas.microsoft.com/office/word/2010/wordprocessingGroup" xmlns:wpi="http://schemas.microsoft.com/office/word/2010/wordprocessingInk" xmlns:wne="http://schemas.microsoft.com/office/word/2006/wordml" xmlns:wps="http://schemas.microsoft.com/office/word/2010/wordprocessingShape" mc:Ignorable="w14 w15 w16se w16cid w16 w16cex w16sdtdh w16sdtfl w16du wp14">
   <w:body>
+    <w:tbl>
+      <w:tblPr>
+        <w:tblStyle w:val="TableGrid0"/>
+        <w:tblW w:w="0" w:type="auto"/>
+        <w:tblInd w:w="-1138" w:type="dxa"/>
+        <w:tblCellMar>
+          <w:top w:w="12" w:type="dxa"/>
+          <w:left w:w="108" w:type="dxa"/>
+          <w:right w:w="53" w:type="dxa"/>
+        </w:tblCellMar>
+        <w:tblLook w:val="04A0" w:firstRow="1" w:lastRow="0" w:firstColumn="1" w:lastColumn="0" w:noHBand="0" w:noVBand="1"/>
+      </w:tblPr>
+      <w:tblGrid>
+        <w:gridCol w:w="521"/>
+        <w:gridCol w:w="2480"/>
+        <w:gridCol w:w="3208"/>
+        <w:gridCol w:w="2859"/>
+        <w:gridCol w:w="1976"/>
+        <w:gridCol w:w="4044"/>
+      </w:tblGrid>
+      <w:tr>
+        <w:trPr>
+          <w:trHeight w:val="265"/>
+        </w:trPr>
+        <w:tc>
+          <w:tcPr>
+            <w:tcW w:w="0" w:type="auto"/>
+            <w:tcBorders>
+              <w:top w:val="single" w:sz="3" w:space="0" w:color="000000"/>
+              <w:left w:val="single" w:sz="3" w:space="0" w:color="000000"/>
+              <w:bottom w:val="single" w:sz="3" w:space="0" w:color="000000"/>
+              <w:right w:val="single" w:sz="3" w:space="0" w:color="000000"/>
+            </w:tcBorders>
+            <w:vAlign w:val="center"/>
+          </w:tcPr>
+          <w:p>
+            <w:pPr>
+              <w:ind w:left="40"/>
+              <w:jc w:val="center"/>
+              <w:rPr>
+                <w:rFonts w:ascii="Arial" w:hAnsi="Arial" w:cs="Arial"/>
+                <w:sz w:val="24"/>
+                <w:szCs w:val="24"/>
+              </w:rPr>
+            </w:pPr>
+            <w:r>
+              <w:rPr>
+                <w:rFonts w:ascii="Arial" w:eastAsia="Arial" w:hAnsi="Arial" w:cs="Arial"/>
+                <w:b/>
+                <w:sz w:val="24"/>
+                <w:szCs w:val="24"/>
+              </w:rPr>
+              <w:t>No</w:t>
+            </w:r>
+          </w:p>
+        </w:tc>
+        <w:tc>
+          <w:tcPr>
+            <w:tcW w:w="0" w:type="auto"/>
+            <w:tcBorders>
+              <w:top w:val="single" w:sz="3" w:space="0" w:color="000000"/>
+              <w:left w:val="single" w:sz="3" w:space="0" w:color="000000"/>
+              <w:bottom w:val="single" w:sz="3" w:space="0" w:color="000000"/>
+              <w:right w:val="single" w:sz="3" w:space="0" w:color="000000"/>
+            </w:tcBorders>
+            <w:vAlign w:val="center"/>
+          </w:tcPr>
+          <w:p>
+            <w:pPr>
+              <w:ind w:right="54"/>
+              <w:jc w:val="center"/>
+              <w:rPr>
+                <w:rFonts w:ascii="Arial" w:hAnsi="Arial" w:cs="Arial"/>
+                <w:sz w:val="24"/>
+                <w:szCs w:val="24"/>
+              </w:rPr>
+            </w:pPr>
+            <w:r>
+              <w:rPr>
+                <w:rFonts w:ascii="Arial" w:eastAsia="Arial" w:hAnsi="Arial" w:cs="Arial"/>
+                <w:b/>
+                <w:sz w:val="24"/>
+                <w:szCs w:val="24"/>
+              </w:rPr>
+              <w:t>Kegiatan</w:t>
+            </w:r>
+          </w:p>
+        </w:tc>
+        <w:tc>
+          <w:tcPr>
+            <w:tcW w:w="0" w:type="auto"/>
+            <w:gridSpan w:val="2"/>
+            <w:tcBorders>
+              <w:top w:val="single" w:sz="3" w:space="0" w:color="000000"/>
+              <w:left w:val="single" w:sz="3" w:space="0" w:color="000000"/>
+              <w:bottom w:val="single" w:sz="3" w:space="0" w:color="000000"/>
+              <w:right w:val="single" w:sz="3" w:space="0" w:color="000000"/>
+            </w:tcBorders>
+            <w:vAlign w:val="center"/>
+          </w:tcPr>
+          <w:p>
+            <w:pPr>
+              <w:jc w:val="center"/>
+              <w:rPr>
+                <w:rFonts w:ascii="Arial" w:hAnsi="Arial" w:cs="Arial"/>
+                <w:sz w:val="24"/>
+                <w:szCs w:val="24"/>
+              </w:rPr>
+            </w:pPr>
+            <w:r>
+              <w:rPr>
+                <w:rFonts w:ascii="Arial" w:eastAsia="Arial" w:hAnsi="Arial" w:cs="Arial"/>
+                <w:b/>
+                <w:sz w:val="24"/>
+                <w:szCs w:val="24"/>
+              </w:rPr>
+              <w:t>Nilai Dasar</w:t>
+            </w:r>
+          </w:p>
+        </w:tc>
+        <w:tc>
+          <w:tcPr>
+            <w:tcW w:w="0" w:type="auto"/>
+            <w:tcBorders>
+              <w:top w:val="single" w:sz="3" w:space="0" w:color="000000"/>
+              <w:left w:val="single" w:sz="3" w:space="0" w:color="000000"/>
+              <w:bottom w:val="single" w:sz="3" w:space="0" w:color="000000"/>
+              <w:right w:val="single" w:sz="3" w:space="0" w:color="000000"/>
+            </w:tcBorders>
+            <w:vAlign w:val="center"/>
+          </w:tcPr>
+          <w:p>
+            <w:pPr>
+              <w:jc w:val="center"/>
+              <w:rPr>
+                <w:rFonts w:ascii="Arial" w:hAnsi="Arial" w:cs="Arial"/>
+                <w:sz w:val="24"/>
+                <w:szCs w:val="24"/>
+              </w:rPr>
+            </w:pPr>
+            <w:r>
+              <w:rPr>
+                <w:rFonts w:ascii="Arial" w:eastAsia="Arial" w:hAnsi="Arial" w:cs="Arial"/>
+                <w:b/>
+                <w:sz w:val="24"/>
+                <w:szCs w:val="24"/>
+              </w:rPr>
+              <w:t>Teknik Implementasi</w:t>
+            </w:r>
+          </w:p>
+        </w:tc>
+        <w:tc>
+          <w:tcPr>
+            <w:tcW w:w="0" w:type="auto"/>
+            <w:tcBorders>
+              <w:top w:val="single" w:sz="3" w:space="0" w:color="000000"/>
+              <w:left w:val="single" w:sz="3" w:space="0" w:color="000000"/>
+              <w:bottom w:val="single" w:sz="3" w:space="0" w:color="000000"/>
+              <w:right w:val="single" w:sz="3" w:space="0" w:color="000000"/>
+            </w:tcBorders>
+            <w:vAlign w:val="center"/>
+          </w:tcPr>
+          <w:p>
+            <w:pPr>
+              <w:ind w:right="55"/>
+              <w:jc w:val="center"/>
+              <w:rPr>
+                <w:rFonts w:ascii="Arial" w:hAnsi="Arial" w:cs="Arial"/>
+                <w:sz w:val="24"/>
+                <w:szCs w:val="24"/>
+                <w:lang w:val="sv-SE"/>
+              </w:rPr>
+            </w:pPr>
+            <w:r>
+              <w:rPr>
+                <w:rFonts w:ascii="Arial" w:eastAsia="Arial" w:hAnsi="Arial" w:cs="Arial"/>
+                <w:b/>
+                <w:sz w:val="24"/>
+                <w:szCs w:val="24"/>
+                <w:lang w:val="sv-SE"/>
+              </w:rPr>
+              <w:t>Gambaran Kualitas Kegiatan (Proses dan Output)</w:t>
+            </w:r>
+          </w:p>
+        </w:tc>
+      </w:tr>
+      <w:tr>
+        <w:trPr>
+          <w:trHeight w:val="832"/>
+        </w:trPr>
+        <w:tc>
+          <w:tcPr>
+            <w:tcW w:w="0" w:type="auto"/>
+            <w:tcBorders>
+              <w:top w:val="single" w:sz="3" w:space="0" w:color="000000"/>
+              <w:left w:val="single" w:sz="3" w:space="0" w:color="000000"/>
+              <w:bottom w:val="single" w:sz="3" w:space="0" w:color="000000"/>
+              <w:right w:val="single" w:sz="3" w:space="0" w:color="000000"/>
+            </w:tcBorders>
+            <w:vAlign w:val="center"/>
+          </w:tcPr>
+          <w:p>
+            <w:pPr>
+              <w:rPr>
+                <w:rFonts w:ascii="Arial" w:eastAsia="Arial" w:hAnsi="Arial" w:cs="Arial"/>
+                <w:sz w:val="24"/>
+                <w:szCs w:val="24"/>
+              </w:rPr>
+            </w:pPr>
+            <w:r>
+              <w:rPr>
+                <w:rFonts w:ascii="Arial" w:eastAsia="Arial" w:hAnsi="Arial" w:cs="Arial"/>
+                <w:sz w:val="24"/>
+                <w:szCs w:val="24"/>
+              </w:rPr>
+              <w:t>1.</w:t>
+            </w:r>
+          </w:p>
+        </w:tc>
+        <w:tc>
+          <w:tcPr>
+            <w:tcW w:w="0" w:type="auto"/>
+            <w:tcBorders>
+              <w:top w:val="single" w:sz="3" w:space="0" w:color="000000"/>
+              <w:left w:val="single" w:sz="3" w:space="0" w:color="000000"/>
+              <w:bottom w:val="single" w:sz="3" w:space="0" w:color="000000"/>
+              <w:right w:val="single" w:sz="3" w:space="0" w:color="000000"/>
+            </w:tcBorders>
+            <w:vAlign w:val="center"/>
+          </w:tcPr>
+          <w:p>
+            <w:pPr>
+              <w:spacing w:line="241" w:lineRule="auto"/>
+              <w:rPr>
+                <w:rFonts w:ascii="Arial" w:eastAsia="Arial" w:hAnsi="Arial" w:cs="Arial"/>
+                <w:sz w:val="24"/>
+                <w:szCs w:val="24"/>
+                <w:lang w:val="sv-SE"/>
+              </w:rPr>
+            </w:pPr>
+            <w:r>
+              <w:rPr>
+                <w:rFonts w:ascii="Arial" w:eastAsia="Arial" w:hAnsi="Arial" w:cs="Arial"/>
+                <w:sz w:val="24"/>
+                <w:szCs w:val="24"/>
+                <w:lang w:val="sv-SE"/>
+              </w:rPr>
+              <w:t xml:space="preserve">Membuat </w:t>
+            </w:r>
+            <w:r>
+              <w:rPr>
+                <w:rFonts w:ascii="Arial" w:eastAsia="Arial" w:hAnsi="Arial" w:cs="Arial"/>
+                <w:i/>
+                <w:iCs/>
+                <w:sz w:val="24"/>
+                <w:szCs w:val="24"/>
+                <w:lang w:val="sv-SE"/>
+              </w:rPr>
+              <w:t xml:space="preserve">local server </w:t>
+            </w:r>
+            <w:r>
+              <w:rPr>
+                <w:rFonts w:ascii="Arial" w:eastAsia="Arial" w:hAnsi="Arial" w:cs="Arial"/>
+                <w:sz w:val="24"/>
+                <w:szCs w:val="24"/>
+                <w:lang w:val="sv-SE"/>
+              </w:rPr>
+              <w:t>sebagai penyimpanan file bersama guna mempermudah kolaborasi antar personel</w:t>
+            </w:r>
+          </w:p>
+        </w:tc>
+        <w:tc>
+          <w:tcPr>
+            <w:tcW w:w="0" w:type="auto"/>
+            <w:tcBorders>
+              <w:top w:val="single" w:sz="3" w:space="0" w:color="000000"/>
+              <w:left w:val="single" w:sz="3" w:space="0" w:color="000000"/>
+              <w:bottom w:val="single" w:sz="3" w:space="0" w:color="000000"/>
+              <w:right w:val="single" w:sz="3" w:space="0" w:color="000000"/>
+            </w:tcBorders>
+            <w:vAlign w:val="center"/>
+          </w:tcPr>
+          <w:p>
+            <w:pPr>
+              <w:rPr>
+                <w:rFonts w:ascii="Arial" w:eastAsia="Arial" w:hAnsi="Arial" w:cs="Arial"/>
+                <w:bCs/>
+                <w:sz w:val="24"/>
+                <w:szCs w:val="24"/>
+                <w:lang w:val="sv-SE"/>
+              </w:rPr>
+            </w:pPr>
+            <w:r>
+              <w:rPr>
+                <w:rFonts w:ascii="Arial" w:eastAsia="Arial" w:hAnsi="Arial" w:cs="Arial"/>
+                <w:b/>
+                <w:sz w:val="24"/>
+                <w:szCs w:val="24"/>
+                <w:lang w:val="sv-SE"/>
+              </w:rPr>
+              <w:t>Berorientasi Pelayanan</w:t>
+            </w:r>
+            <w:r>
+              <w:rPr>
+                <w:rFonts w:ascii="Arial" w:eastAsia="Arial" w:hAnsi="Arial" w:cs="Arial"/>
+                <w:b/>
+                <w:sz w:val="24"/>
+                <w:szCs w:val="24"/>
+                <w:lang w:val="sv-SE"/>
+              </w:rPr>
+              <w:br/>
+            </w:r>
+            <w:r>
+              <w:rPr>
+                <w:rFonts w:ascii="Arial" w:eastAsia="Arial" w:hAnsi="Arial" w:cs="Arial"/>
+                <w:bCs/>
+                <w:sz w:val="24"/>
+                <w:szCs w:val="24"/>
+              </w:rPr>
+              <w:t>Pembuatan server bersama mempermudah akses informasi bagi seluruh personel, mempercepat layanan administrasi</w:t>
+            </w:r>
+            <w:r>
+              <w:rPr>
+                <w:rFonts w:ascii="Arial" w:eastAsia="Arial" w:hAnsi="Arial" w:cs="Arial"/>
+                <w:bCs/>
+                <w:sz w:val="24"/>
+                <w:szCs w:val="24"/>
+              </w:rPr>
+              <w:t>,</w:t>
+            </w:r>
+            <w:r>
+              <w:rPr>
+                <w:rFonts w:ascii="Arial" w:eastAsia="Arial" w:hAnsi="Arial" w:cs="Arial"/>
+                <w:bCs/>
+                <w:sz w:val="24"/>
+                <w:szCs w:val="24"/>
+              </w:rPr>
+              <w:t xml:space="preserve"> dan respons terhadap kebutuhan operasional.</w:t>
+            </w:r>
+          </w:p>
+          <w:p>
+            <w:pPr>
+              <w:rPr>
+                <w:rFonts w:ascii="Arial" w:eastAsia="Arial" w:hAnsi="Arial" w:cs="Arial"/>
+                <w:bCs/>
+                <w:sz w:val="24"/>
+                <w:szCs w:val="24"/>
+                <w:lang w:val="sv-SE"/>
+              </w:rPr>
+            </w:pPr>
+            <w:r>
+              <w:rPr>
+                <w:rFonts w:ascii="Arial" w:eastAsia="Arial" w:hAnsi="Arial" w:cs="Arial"/>
+                <w:b/>
+                <w:sz w:val="24"/>
+                <w:szCs w:val="24"/>
+                <w:lang w:val="sv-SE"/>
+              </w:rPr>
+              <w:t>Akuntabel</w:t>
+            </w:r>
+            <w:r>
+              <w:rPr>
+                <w:rFonts w:ascii="Arial" w:eastAsia="Arial" w:hAnsi="Arial" w:cs="Arial"/>
+                <w:b/>
+                <w:sz w:val="24"/>
+                <w:szCs w:val="24"/>
+                <w:lang w:val="sv-SE"/>
+              </w:rPr>
+              <w:br/>
+            </w:r>
+            <w:r>
+              <w:rPr>
+                <w:rFonts w:ascii="Arial" w:eastAsia="Arial" w:hAnsi="Arial" w:cs="Arial"/>
+                <w:bCs/>
+                <w:sz w:val="24"/>
+                <w:szCs w:val="24"/>
+              </w:rPr>
+              <w:t xml:space="preserve">Server yang terkelola dengan baik </w:t>
+            </w:r>
+            <w:r>
+              <w:rPr>
+                <w:rFonts w:ascii="Arial" w:eastAsia="Arial" w:hAnsi="Arial" w:cs="Arial"/>
+                <w:bCs/>
+                <w:sz w:val="24"/>
+                <w:szCs w:val="24"/>
+              </w:rPr>
+              <w:t>dapat menunjang kinerja dengan baik pula</w:t>
+            </w:r>
+            <w:r>
+              <w:rPr>
+                <w:rFonts w:ascii="Arial" w:eastAsia="Arial" w:hAnsi="Arial" w:cs="Arial"/>
+                <w:bCs/>
+                <w:sz w:val="24"/>
+                <w:szCs w:val="24"/>
+              </w:rPr>
+              <w:t>.</w:t>
+            </w:r>
+          </w:p>
+          <w:p>
+            <w:pPr>
+              <w:rPr>
+                <w:rFonts w:ascii="Arial" w:eastAsia="Arial" w:hAnsi="Arial" w:cs="Arial"/>
+                <w:bCs/>
+                <w:sz w:val="24"/>
+                <w:szCs w:val="24"/>
+                <w:lang w:val="sv-SE"/>
+              </w:rPr>
+            </w:pPr>
+            <w:r>
+              <w:rPr>
+                <w:rFonts w:ascii="Arial" w:eastAsia="Arial" w:hAnsi="Arial" w:cs="Arial"/>
+                <w:b/>
+                <w:sz w:val="24"/>
+                <w:szCs w:val="24"/>
+                <w:lang w:val="sv-SE"/>
+              </w:rPr>
+              <w:t>Kolaboratif</w:t>
+            </w:r>
+            <w:r>
+              <w:rPr>
+                <w:rFonts w:ascii="Arial" w:eastAsia="Arial" w:hAnsi="Arial" w:cs="Arial"/>
+                <w:b/>
+                <w:sz w:val="24"/>
+                <w:szCs w:val="24"/>
+                <w:lang w:val="sv-SE"/>
+              </w:rPr>
+              <w:br/>
+            </w:r>
+            <w:r>
+              <w:rPr>
+                <w:rFonts w:ascii="Arial" w:eastAsia="Arial" w:hAnsi="Arial" w:cs="Arial"/>
+                <w:bCs/>
+                <w:sz w:val="24"/>
+                <w:szCs w:val="24"/>
+              </w:rPr>
+              <w:t>Fasilitas penyimpanan bersama mendukung kerja sama tim dan berbagi pengetahuan secara efektif.</w:t>
+            </w:r>
+          </w:p>
+          <w:p>
+            <w:pPr>
+              <w:rPr>
+                <w:rFonts w:ascii="Arial" w:eastAsia="Arial" w:hAnsi="Arial" w:cs="Arial"/>
+                <w:bCs/>
+                <w:sz w:val="24"/>
+                <w:szCs w:val="24"/>
+                <w:lang w:val="sv-SE"/>
+              </w:rPr>
+            </w:pPr>
+            <w:r>
+              <w:rPr>
+                <w:rFonts w:ascii="Arial" w:eastAsia="Arial" w:hAnsi="Arial" w:cs="Arial"/>
+                <w:b/>
+                <w:sz w:val="24"/>
+                <w:szCs w:val="24"/>
+                <w:lang w:val="sv-SE"/>
+              </w:rPr>
+              <w:t>Adaptif</w:t>
+            </w:r>
+            <w:r>
+              <w:rPr>
+                <w:rFonts w:ascii="Arial" w:eastAsia="Arial" w:hAnsi="Arial" w:cs="Arial"/>
+                <w:b/>
+                <w:sz w:val="24"/>
+                <w:szCs w:val="24"/>
+                <w:lang w:val="sv-SE"/>
+              </w:rPr>
+              <w:br/>
+            </w:r>
+            <w:r>
+              <w:rPr>
+                <w:rFonts w:ascii="Arial" w:eastAsia="Arial" w:hAnsi="Arial" w:cs="Arial"/>
+                <w:bCs/>
+                <w:sz w:val="24"/>
+                <w:szCs w:val="24"/>
+              </w:rPr>
+              <w:t xml:space="preserve">Kemampuan menyediakan infrastruktur teknologi yang responsif terhadap </w:t>
+            </w:r>
+            <w:r>
+              <w:rPr>
+                <w:rFonts w:ascii="Arial" w:eastAsia="Arial" w:hAnsi="Arial" w:cs="Arial"/>
+                <w:bCs/>
+                <w:sz w:val="24"/>
+                <w:szCs w:val="24"/>
+              </w:rPr>
+              <w:lastRenderedPageBreak/>
+              <w:t>kebutuhan kolaborasi modern.</w:t>
+            </w:r>
+          </w:p>
+        </w:tc>
+        <w:tc>
+          <w:tcPr>
+            <w:tcW w:w="0" w:type="auto"/>
+            <w:tcBorders>
+              <w:top w:val="single" w:sz="3" w:space="0" w:color="000000"/>
+              <w:left w:val="single" w:sz="3" w:space="0" w:color="000000"/>
+              <w:bottom w:val="single" w:sz="3" w:space="0" w:color="000000"/>
+              <w:right w:val="single" w:sz="3" w:space="0" w:color="000000"/>
+            </w:tcBorders>
+            <w:vAlign w:val="center"/>
+          </w:tcPr>
+          <w:p>
+            <w:pPr>
+              <w:ind w:left="20"/>
+              <w:rPr>
+                <w:rFonts w:ascii="Arial" w:eastAsia="Arial" w:hAnsi="Arial" w:cs="Arial"/>
+                <w:bCs/>
+                <w:sz w:val="24"/>
+                <w:szCs w:val="24"/>
+                <w:lang w:val="sv-SE"/>
+              </w:rPr>
+            </w:pPr>
+            <w:r>
+              <w:rPr>
+                <w:rFonts w:ascii="Arial" w:eastAsia="Arial" w:hAnsi="Arial" w:cs="Arial"/>
+                <w:b/>
+                <w:sz w:val="24"/>
+                <w:szCs w:val="24"/>
+                <w:lang w:val="sv-SE"/>
+              </w:rPr>
+              <w:lastRenderedPageBreak/>
+              <w:t>Manajemen ASN</w:t>
+            </w:r>
+            <w:r>
+              <w:rPr>
+                <w:rFonts w:ascii="Arial" w:eastAsia="Arial" w:hAnsi="Arial" w:cs="Arial"/>
+                <w:b/>
+                <w:sz w:val="24"/>
+                <w:szCs w:val="24"/>
+                <w:lang w:val="sv-SE"/>
+              </w:rPr>
+              <w:br/>
+            </w:r>
+            <w:r>
+              <w:rPr>
+                <w:rFonts w:ascii="Arial" w:eastAsia="Arial" w:hAnsi="Arial" w:cs="Arial"/>
+                <w:bCs/>
+                <w:sz w:val="24"/>
+                <w:szCs w:val="24"/>
+              </w:rPr>
+              <w:t>M</w:t>
+            </w:r>
+            <w:r>
+              <w:rPr>
+                <w:rFonts w:ascii="Arial" w:eastAsia="Arial" w:hAnsi="Arial" w:cs="Arial"/>
+                <w:bCs/>
+                <w:sz w:val="24"/>
+                <w:szCs w:val="24"/>
+              </w:rPr>
+              <w:t>empersingkat waktu koordinasi melalui akses data terpusat.</w:t>
+            </w:r>
+          </w:p>
+          <w:p>
+            <w:pPr>
+              <w:ind w:left="20"/>
+              <w:rPr>
+                <w:rFonts w:ascii="Arial" w:eastAsia="Arial" w:hAnsi="Arial" w:cs="Arial"/>
+                <w:bCs/>
+                <w:sz w:val="24"/>
+                <w:szCs w:val="24"/>
+                <w:lang w:val="sv-SE"/>
+              </w:rPr>
+            </w:pPr>
+            <w:r>
+              <w:rPr>
+                <w:rFonts w:ascii="Arial" w:eastAsia="Arial" w:hAnsi="Arial" w:cs="Arial"/>
+                <w:b/>
+                <w:sz w:val="24"/>
+                <w:szCs w:val="24"/>
+                <w:lang w:val="sv-SE"/>
+              </w:rPr>
+              <w:t>Smart ASN</w:t>
+            </w:r>
+            <w:r>
+              <w:rPr>
+                <w:rFonts w:ascii="Arial" w:eastAsia="Arial" w:hAnsi="Arial" w:cs="Arial"/>
+                <w:b/>
+                <w:sz w:val="24"/>
+                <w:szCs w:val="24"/>
+                <w:lang w:val="sv-SE"/>
+              </w:rPr>
+              <w:br/>
+            </w:r>
+            <w:r>
+              <w:rPr>
+                <w:rFonts w:ascii="Arial" w:eastAsia="Arial" w:hAnsi="Arial" w:cs="Arial"/>
+                <w:bCs/>
+                <w:sz w:val="24"/>
+                <w:szCs w:val="24"/>
+                <w:lang w:val="sv-SE"/>
+              </w:rPr>
+              <w:t>Mendukung terciptany</w:t>
+            </w:r>
+            <w:r>
+              <w:rPr>
+                <w:rFonts w:ascii="Arial" w:eastAsia="Arial" w:hAnsi="Arial" w:cs="Arial"/>
+                <w:bCs/>
+                <w:sz w:val="24"/>
+                <w:szCs w:val="24"/>
+                <w:lang w:val="sv-SE"/>
+              </w:rPr>
+              <w:t>a</w:t>
+            </w:r>
+            <w:r>
+              <w:rPr>
+                <w:rFonts w:ascii="Arial" w:eastAsia="Arial" w:hAnsi="Arial" w:cs="Arial"/>
+                <w:bCs/>
+                <w:sz w:val="24"/>
+                <w:szCs w:val="24"/>
+                <w:lang w:val="sv-SE"/>
+              </w:rPr>
+              <w:t xml:space="preserve"> ekosistem kerja yang kolaboratif.</w:t>
+            </w:r>
+          </w:p>
+        </w:tc>
+        <w:tc>
+          <w:tcPr>
+            <w:tcW w:w="0" w:type="auto"/>
+            <w:tcBorders>
+              <w:top w:val="single" w:sz="3" w:space="0" w:color="000000"/>
+              <w:left w:val="single" w:sz="3" w:space="0" w:color="000000"/>
+              <w:bottom w:val="single" w:sz="3" w:space="0" w:color="000000"/>
+              <w:right w:val="single" w:sz="3" w:space="0" w:color="000000"/>
+            </w:tcBorders>
+            <w:vAlign w:val="center"/>
+          </w:tcPr>
+          <w:p>
+            <w:pPr>
+              <w:rPr>
+                <w:rFonts w:ascii="Arial" w:eastAsia="Arial" w:hAnsi="Arial" w:cs="Arial"/>
+                <w:sz w:val="24"/>
+                <w:szCs w:val="24"/>
+              </w:rPr>
+            </w:pPr>
+            <w:r>
+              <w:rPr>
+                <w:rFonts w:ascii="Arial" w:eastAsia="Arial" w:hAnsi="Arial" w:cs="Arial"/>
+                <w:sz w:val="24"/>
+                <w:szCs w:val="24"/>
+              </w:rPr>
+              <w:t xml:space="preserve">Koordinasi dengan </w:t>
+            </w:r>
+            <w:r>
+              <w:rPr>
+                <w:rFonts w:ascii="Arial" w:eastAsia="Arial" w:hAnsi="Arial" w:cs="Arial"/>
+                <w:sz w:val="24"/>
+                <w:szCs w:val="24"/>
+              </w:rPr>
+              <w:t>personel</w:t>
+            </w:r>
+            <w:r>
+              <w:rPr>
+                <w:rFonts w:ascii="Arial" w:eastAsia="Arial" w:hAnsi="Arial" w:cs="Arial"/>
+                <w:sz w:val="24"/>
+                <w:szCs w:val="24"/>
+              </w:rPr>
+              <w:t xml:space="preserve"> terkait</w:t>
+            </w:r>
+          </w:p>
+        </w:tc>
+        <w:tc>
+          <w:tcPr>
+            <w:tcW w:w="0" w:type="auto"/>
+            <w:tcBorders>
+              <w:top w:val="single" w:sz="3" w:space="0" w:color="000000"/>
+              <w:left w:val="single" w:sz="3" w:space="0" w:color="000000"/>
+              <w:bottom w:val="single" w:sz="3" w:space="0" w:color="000000"/>
+              <w:right w:val="single" w:sz="3" w:space="0" w:color="000000"/>
+            </w:tcBorders>
+            <w:vAlign w:val="center"/>
+          </w:tcPr>
+          <w:p>
+            <w:pPr>
+              <w:spacing w:line="241" w:lineRule="auto"/>
+              <w:ind w:right="60"/>
+              <w:rPr>
+                <w:rFonts w:ascii="Arial" w:eastAsia="Arial" w:hAnsi="Arial" w:cs="Arial"/>
+                <w:sz w:val="24"/>
+                <w:szCs w:val="24"/>
+              </w:rPr>
+            </w:pPr>
+            <w:r>
+              <w:rPr>
+                <w:rFonts w:ascii="Arial" w:eastAsia="Arial" w:hAnsi="Arial" w:cs="Arial"/>
+                <w:sz w:val="24"/>
+                <w:szCs w:val="24"/>
+              </w:rPr>
+              <w:t xml:space="preserve">Diawali dengan meminta arahan kepada atasan kemudian dilanjutkan dengan melakukan koordinasi dengan personel terkait. Setelah itu, menyiapkan semua peralatan dan perlengkapan yang dibutuhkan kemudian memulai membuat </w:t>
+            </w:r>
+            <w:r>
+              <w:rPr>
+                <w:rFonts w:ascii="Arial" w:eastAsia="Arial" w:hAnsi="Arial" w:cs="Arial"/>
+                <w:i/>
+                <w:iCs/>
+                <w:sz w:val="24"/>
+                <w:szCs w:val="24"/>
+              </w:rPr>
+              <w:t>local server</w:t>
+            </w:r>
+            <w:r>
+              <w:rPr>
+                <w:rFonts w:ascii="Arial" w:eastAsia="Arial" w:hAnsi="Arial" w:cs="Arial"/>
+                <w:sz w:val="24"/>
+                <w:szCs w:val="24"/>
+              </w:rPr>
+              <w:t>.</w:t>
+            </w:r>
+          </w:p>
+          <w:p>
+            <w:pPr>
+              <w:spacing w:line="241" w:lineRule="auto"/>
+              <w:ind w:right="60"/>
+              <w:rPr>
+                <w:rFonts w:ascii="Arial" w:eastAsia="Arial" w:hAnsi="Arial" w:cs="Arial"/>
+                <w:sz w:val="24"/>
+                <w:szCs w:val="24"/>
+              </w:rPr>
+            </w:pPr>
+            <w:r>
+              <w:rPr>
+                <w:rFonts w:ascii="Arial" w:eastAsia="Arial" w:hAnsi="Arial" w:cs="Arial"/>
+                <w:b/>
+                <w:bCs/>
+                <w:sz w:val="24"/>
+                <w:szCs w:val="24"/>
+              </w:rPr>
+              <w:t>Output:</w:t>
+            </w:r>
+            <w:r>
+              <w:rPr>
+                <w:rFonts w:ascii="Arial" w:eastAsia="Arial" w:hAnsi="Arial" w:cs="Arial"/>
+                <w:b/>
+                <w:bCs/>
+                <w:sz w:val="24"/>
+                <w:szCs w:val="24"/>
+              </w:rPr>
+              <w:t xml:space="preserve"> </w:t>
+            </w:r>
+            <w:r>
+              <w:rPr>
+                <w:rFonts w:ascii="Arial" w:eastAsia="Arial" w:hAnsi="Arial" w:cs="Arial"/>
+                <w:sz w:val="24"/>
+                <w:szCs w:val="24"/>
+              </w:rPr>
+              <w:t xml:space="preserve">Dari kegiatan yang dilakukan, hasil yang didapatkan yaitu sebuah </w:t>
+            </w:r>
+            <w:r>
+              <w:rPr>
+                <w:rFonts w:ascii="Arial" w:eastAsia="Arial" w:hAnsi="Arial" w:cs="Arial"/>
+                <w:i/>
+                <w:iCs/>
+                <w:sz w:val="24"/>
+                <w:szCs w:val="24"/>
+              </w:rPr>
+              <w:t>local server</w:t>
+            </w:r>
+            <w:r>
+              <w:rPr>
+                <w:rFonts w:ascii="Arial" w:eastAsia="Arial" w:hAnsi="Arial" w:cs="Arial"/>
+                <w:sz w:val="24"/>
+                <w:szCs w:val="24"/>
+              </w:rPr>
+              <w:t xml:space="preserve"> yang bisa </w:t>
+            </w:r>
+            <w:r>
+              <w:rPr>
+                <w:rFonts w:ascii="Arial" w:eastAsia="Arial" w:hAnsi="Arial" w:cs="Arial"/>
+                <w:sz w:val="24"/>
+                <w:szCs w:val="24"/>
+              </w:rPr>
+              <w:t>dimanfaatkan</w:t>
+            </w:r>
+            <w:r>
+              <w:rPr>
+                <w:rFonts w:ascii="Arial" w:eastAsia="Arial" w:hAnsi="Arial" w:cs="Arial"/>
+                <w:sz w:val="24"/>
+                <w:szCs w:val="24"/>
+              </w:rPr>
+              <w:t xml:space="preserve"> untuk keperluan pekerjaan</w:t>
+            </w:r>
+            <w:r>
+              <w:rPr>
+                <w:rFonts w:ascii="Arial" w:eastAsia="Arial" w:hAnsi="Arial" w:cs="Arial"/>
+                <w:sz w:val="24"/>
+                <w:szCs w:val="24"/>
+              </w:rPr>
+              <w:t>.</w:t>
+            </w:r>
+          </w:p>
+        </w:tc>
+      </w:tr>
+      <w:tr>
+        <w:trPr>
+          <w:trHeight w:val="407"/>
+        </w:trPr>
+        <w:tc>
+          <w:tcPr>
+            <w:tcW w:w="0" w:type="auto"/>
+            <w:tcBorders>
+              <w:top w:val="single" w:sz="3" w:space="0" w:color="000000"/>
+              <w:left w:val="single" w:sz="3" w:space="0" w:color="000000"/>
+              <w:bottom w:val="single" w:sz="3" w:space="0" w:color="000000"/>
+              <w:right w:val="single" w:sz="3" w:space="0" w:color="000000"/>
+            </w:tcBorders>
+            <w:vAlign w:val="center"/>
+          </w:tcPr>
+          <w:p>
+            <w:pPr>
+              <w:rPr>
+                <w:rFonts w:ascii="Arial" w:eastAsia="Arial" w:hAnsi="Arial" w:cs="Arial"/>
+                <w:sz w:val="24"/>
+                <w:szCs w:val="24"/>
+              </w:rPr>
+            </w:pPr>
+            <w:r>
+              <w:rPr>
+                <w:rFonts w:ascii="Arial" w:eastAsia="Arial" w:hAnsi="Arial" w:cs="Arial"/>
+                <w:sz w:val="24"/>
+                <w:szCs w:val="24"/>
+              </w:rPr>
+              <w:t>2.</w:t>
+            </w:r>
+          </w:p>
+        </w:tc>
+        <w:tc>
+          <w:tcPr>
+            <w:tcW w:w="0" w:type="auto"/>
+            <w:tcBorders>
+              <w:top w:val="single" w:sz="3" w:space="0" w:color="000000"/>
+              <w:left w:val="single" w:sz="3" w:space="0" w:color="000000"/>
+              <w:bottom w:val="single" w:sz="3" w:space="0" w:color="000000"/>
+              <w:right w:val="single" w:sz="3" w:space="0" w:color="000000"/>
+            </w:tcBorders>
+            <w:vAlign w:val="center"/>
+          </w:tcPr>
+          <w:p>
+            <w:pPr>
+              <w:spacing w:line="241" w:lineRule="auto"/>
+              <w:rPr>
+                <w:rFonts w:ascii="Arial" w:eastAsia="Arial" w:hAnsi="Arial" w:cs="Arial"/>
+                <w:sz w:val="24"/>
+                <w:szCs w:val="24"/>
+                <w:lang w:val="sv-SE"/>
+              </w:rPr>
+            </w:pPr>
+            <w:r>
+              <w:rPr>
+                <w:rFonts w:ascii="Arial" w:eastAsia="Arial" w:hAnsi="Arial" w:cs="Arial"/>
+                <w:sz w:val="24"/>
+                <w:szCs w:val="24"/>
+                <w:lang w:val="sv-SE"/>
+              </w:rPr>
+              <w:t xml:space="preserve">Melakukan simulasi penggunaan </w:t>
+            </w:r>
+            <w:r>
+              <w:rPr>
+                <w:rFonts w:ascii="Arial" w:eastAsia="Arial" w:hAnsi="Arial" w:cs="Arial"/>
+                <w:i/>
+                <w:iCs/>
+                <w:sz w:val="24"/>
+                <w:szCs w:val="24"/>
+                <w:lang w:val="sv-SE"/>
+              </w:rPr>
+              <w:t>local server</w:t>
+            </w:r>
+          </w:p>
+        </w:tc>
+        <w:tc>
+          <w:tcPr>
+            <w:tcW w:w="0" w:type="auto"/>
+            <w:tcBorders>
+              <w:top w:val="single" w:sz="3" w:space="0" w:color="000000"/>
+              <w:left w:val="single" w:sz="3" w:space="0" w:color="000000"/>
+              <w:bottom w:val="single" w:sz="3" w:space="0" w:color="000000"/>
+              <w:right w:val="single" w:sz="3" w:space="0" w:color="000000"/>
+            </w:tcBorders>
+            <w:vAlign w:val="center"/>
+          </w:tcPr>
+          <w:p>
+            <w:pPr>
+              <w:rPr>
+                <w:rFonts w:ascii="Arial" w:eastAsia="Arial" w:hAnsi="Arial" w:cs="Arial"/>
+                <w:bCs/>
+                <w:sz w:val="24"/>
+                <w:szCs w:val="24"/>
+                <w:lang w:val="sv-SE"/>
+              </w:rPr>
+            </w:pPr>
+            <w:r>
+              <w:rPr>
+                <w:rFonts w:ascii="Arial" w:eastAsia="Arial" w:hAnsi="Arial" w:cs="Arial"/>
+                <w:b/>
+                <w:sz w:val="24"/>
+                <w:szCs w:val="24"/>
+                <w:lang w:val="sv-SE"/>
+              </w:rPr>
+              <w:t>Akuntabel</w:t>
+            </w:r>
+            <w:r>
+              <w:rPr>
+                <w:rFonts w:ascii="Arial" w:eastAsia="Arial" w:hAnsi="Arial" w:cs="Arial"/>
+                <w:b/>
+                <w:sz w:val="24"/>
+                <w:szCs w:val="24"/>
+                <w:lang w:val="sv-SE"/>
+              </w:rPr>
+              <w:br/>
+            </w:r>
+            <w:r>
+              <w:rPr>
+                <w:rFonts w:ascii="Arial" w:eastAsia="Arial" w:hAnsi="Arial" w:cs="Arial"/>
+                <w:bCs/>
+                <w:sz w:val="24"/>
+                <w:szCs w:val="24"/>
+              </w:rPr>
+              <w:t xml:space="preserve">Simulasi penggunaan memastikan </w:t>
+            </w:r>
+            <w:r>
+              <w:rPr>
+                <w:rFonts w:ascii="Arial" w:eastAsia="Arial" w:hAnsi="Arial" w:cs="Arial"/>
+                <w:bCs/>
+                <w:sz w:val="24"/>
+                <w:szCs w:val="24"/>
+              </w:rPr>
+              <w:t>layak atau tidak sebelum benar-benar digunakan.</w:t>
+            </w:r>
+            <w:r>
+              <w:rPr>
+                <w:rFonts w:ascii="Arial" w:eastAsia="Arial" w:hAnsi="Arial" w:cs="Arial"/>
+                <w:bCs/>
+                <w:sz w:val="24"/>
+                <w:szCs w:val="24"/>
+              </w:rPr>
+              <w:t> </w:t>
+            </w:r>
+          </w:p>
+          <w:p>
+            <w:pPr>
+              <w:rPr>
+                <w:rFonts w:ascii="Arial" w:eastAsia="Arial" w:hAnsi="Arial" w:cs="Arial"/>
+                <w:bCs/>
+                <w:sz w:val="24"/>
+                <w:szCs w:val="24"/>
+                <w:lang w:val="sv-SE"/>
+              </w:rPr>
+            </w:pPr>
+            <w:r>
+              <w:rPr>
+                <w:rFonts w:ascii="Arial" w:eastAsia="Arial" w:hAnsi="Arial" w:cs="Arial"/>
+                <w:b/>
+                <w:sz w:val="24"/>
+                <w:szCs w:val="24"/>
+                <w:lang w:val="sv-SE"/>
+              </w:rPr>
+              <w:t>Kompeten</w:t>
+            </w:r>
+            <w:r>
+              <w:rPr>
+                <w:rFonts w:ascii="Arial" w:eastAsia="Arial" w:hAnsi="Arial" w:cs="Arial"/>
+                <w:b/>
+                <w:sz w:val="24"/>
+                <w:szCs w:val="24"/>
+                <w:lang w:val="sv-SE"/>
+              </w:rPr>
+              <w:br/>
+            </w:r>
+            <w:r>
+              <w:rPr>
+                <w:rFonts w:ascii="Arial" w:eastAsia="Arial" w:hAnsi="Arial" w:cs="Arial"/>
+                <w:bCs/>
+                <w:sz w:val="24"/>
+                <w:szCs w:val="24"/>
+              </w:rPr>
+              <w:t>Kemampuan melakukan simulasi teknis menunjukkan penguasaan teknologi dan pemahaman infrastruktur digital yang memadai.</w:t>
+            </w:r>
+          </w:p>
+          <w:p>
+            <w:pPr>
+              <w:rPr>
+                <w:rFonts w:ascii="Arial" w:eastAsia="Arial" w:hAnsi="Arial" w:cs="Arial"/>
+                <w:bCs/>
+                <w:sz w:val="24"/>
+                <w:szCs w:val="24"/>
+                <w:lang w:val="sv-SE"/>
+              </w:rPr>
+            </w:pPr>
+            <w:r>
+              <w:rPr>
+                <w:rFonts w:ascii="Arial" w:eastAsia="Arial" w:hAnsi="Arial" w:cs="Arial"/>
+                <w:b/>
+                <w:sz w:val="24"/>
+                <w:szCs w:val="24"/>
+                <w:lang w:val="sv-SE"/>
+              </w:rPr>
+              <w:t>Adaptif</w:t>
+            </w:r>
+            <w:r>
+              <w:rPr>
+                <w:rFonts w:ascii="Arial" w:eastAsia="Arial" w:hAnsi="Arial" w:cs="Arial"/>
+                <w:b/>
+                <w:sz w:val="24"/>
+                <w:szCs w:val="24"/>
+                <w:lang w:val="sv-SE"/>
+              </w:rPr>
+              <w:br/>
+            </w:r>
+            <w:r>
+              <w:rPr>
+                <w:rFonts w:ascii="Arial" w:eastAsia="Arial" w:hAnsi="Arial" w:cs="Arial"/>
+                <w:bCs/>
+                <w:sz w:val="24"/>
+                <w:szCs w:val="24"/>
+              </w:rPr>
+              <w:t xml:space="preserve">Proses simulasi memungkinkan penyesuaian konfigurasi untuk mengoptimalkan kinerja </w:t>
+            </w:r>
+            <w:r>
+              <w:rPr>
+                <w:rFonts w:ascii="Arial" w:eastAsia="Arial" w:hAnsi="Arial" w:cs="Arial"/>
+                <w:bCs/>
+                <w:i/>
+                <w:iCs/>
+                <w:sz w:val="24"/>
+                <w:szCs w:val="24"/>
+              </w:rPr>
+              <w:t>server</w:t>
+            </w:r>
+            <w:r>
+              <w:rPr>
+                <w:rFonts w:ascii="Arial" w:eastAsia="Arial" w:hAnsi="Arial" w:cs="Arial"/>
+                <w:bCs/>
+                <w:sz w:val="24"/>
+                <w:szCs w:val="24"/>
+              </w:rPr>
+              <w:t>.</w:t>
+            </w:r>
+          </w:p>
+          <w:p>
+            <w:pPr>
+              <w:rPr>
+                <w:rFonts w:ascii="Arial" w:eastAsia="Arial" w:hAnsi="Arial" w:cs="Arial"/>
+                <w:bCs/>
+                <w:sz w:val="24"/>
+                <w:szCs w:val="24"/>
+                <w:lang w:val="sv-SE"/>
+              </w:rPr>
+            </w:pPr>
+            <w:r>
+              <w:rPr>
+                <w:rFonts w:ascii="Arial" w:eastAsia="Arial" w:hAnsi="Arial" w:cs="Arial"/>
+                <w:b/>
+                <w:sz w:val="24"/>
+                <w:szCs w:val="24"/>
+                <w:lang w:val="sv-SE"/>
+              </w:rPr>
+              <w:t>Kolaboratif</w:t>
+            </w:r>
+            <w:r>
+              <w:rPr>
+                <w:rFonts w:ascii="Arial" w:eastAsia="Arial" w:hAnsi="Arial" w:cs="Arial"/>
+                <w:b/>
+                <w:sz w:val="24"/>
+                <w:szCs w:val="24"/>
+                <w:lang w:val="sv-SE"/>
+              </w:rPr>
+              <w:br/>
+            </w:r>
+            <w:r>
+              <w:rPr>
+                <w:rFonts w:ascii="Arial" w:eastAsia="Arial" w:hAnsi="Arial" w:cs="Arial"/>
+                <w:bCs/>
+                <w:sz w:val="24"/>
+                <w:szCs w:val="24"/>
+              </w:rPr>
+              <w:t xml:space="preserve">Simulasi memastikan </w:t>
+            </w:r>
+            <w:r>
+              <w:rPr>
+                <w:rFonts w:ascii="Arial" w:eastAsia="Arial" w:hAnsi="Arial" w:cs="Arial"/>
+                <w:bCs/>
+                <w:i/>
+                <w:iCs/>
+                <w:sz w:val="24"/>
+                <w:szCs w:val="24"/>
+              </w:rPr>
+              <w:t>server</w:t>
+            </w:r>
+            <w:r>
+              <w:rPr>
+                <w:rFonts w:ascii="Arial" w:eastAsia="Arial" w:hAnsi="Arial" w:cs="Arial"/>
+                <w:bCs/>
+                <w:sz w:val="24"/>
+                <w:szCs w:val="24"/>
+              </w:rPr>
+              <w:t xml:space="preserve"> dapat mendukung kebutuhan kolaborasi.</w:t>
+            </w:r>
+          </w:p>
+        </w:tc>
+        <w:tc>
+          <w:tcPr>
+            <w:tcW w:w="0" w:type="auto"/>
+            <w:tcBorders>
+              <w:top w:val="single" w:sz="3" w:space="0" w:color="000000"/>
+              <w:left w:val="single" w:sz="3" w:space="0" w:color="000000"/>
+              <w:bottom w:val="single" w:sz="3" w:space="0" w:color="000000"/>
+              <w:right w:val="single" w:sz="3" w:space="0" w:color="000000"/>
+            </w:tcBorders>
+            <w:vAlign w:val="center"/>
+          </w:tcPr>
+          <w:p>
+            <w:pPr>
+              <w:ind w:left="20"/>
+              <w:rPr>
+                <w:rFonts w:ascii="Arial" w:eastAsia="Arial" w:hAnsi="Arial" w:cs="Arial"/>
+                <w:bCs/>
+                <w:sz w:val="24"/>
+                <w:szCs w:val="24"/>
+                <w:lang w:val="sv-SE"/>
+              </w:rPr>
+            </w:pPr>
+            <w:r>
+              <w:rPr>
+                <w:rFonts w:ascii="Arial" w:eastAsia="Arial" w:hAnsi="Arial" w:cs="Arial"/>
+                <w:b/>
+                <w:sz w:val="24"/>
+                <w:szCs w:val="24"/>
+                <w:lang w:val="sv-SE"/>
+              </w:rPr>
+              <w:t>Manajemen ASN</w:t>
+            </w:r>
+            <w:r>
+              <w:rPr>
+                <w:rFonts w:ascii="Arial" w:eastAsia="Arial" w:hAnsi="Arial" w:cs="Arial"/>
+                <w:b/>
+                <w:sz w:val="24"/>
+                <w:szCs w:val="24"/>
+                <w:lang w:val="sv-SE"/>
+              </w:rPr>
+              <w:br/>
+            </w:r>
+            <w:r>
+              <w:rPr>
+                <w:rFonts w:ascii="Arial" w:eastAsia="Arial" w:hAnsi="Arial" w:cs="Arial"/>
+                <w:bCs/>
+                <w:sz w:val="24"/>
+                <w:szCs w:val="24"/>
+              </w:rPr>
+              <w:t>Simulasi membantu mengidentifikasi potensi risiko dan kelemahan sistem sebelum digunakan secara operasional.</w:t>
+            </w:r>
+          </w:p>
+          <w:p>
+            <w:pPr>
+              <w:ind w:left="20"/>
+              <w:rPr>
+                <w:rFonts w:ascii="Arial" w:eastAsia="Arial" w:hAnsi="Arial" w:cs="Arial"/>
+                <w:bCs/>
+                <w:sz w:val="24"/>
+                <w:szCs w:val="24"/>
+                <w:lang w:val="sv-SE"/>
+              </w:rPr>
+            </w:pPr>
+            <w:r>
+              <w:rPr>
+                <w:rFonts w:ascii="Arial" w:eastAsia="Arial" w:hAnsi="Arial" w:cs="Arial"/>
+                <w:b/>
+                <w:sz w:val="24"/>
+                <w:szCs w:val="24"/>
+                <w:lang w:val="sv-SE"/>
+              </w:rPr>
+              <w:t>Smart ASN</w:t>
+            </w:r>
+            <w:r>
+              <w:rPr>
+                <w:rFonts w:ascii="Arial" w:eastAsia="Arial" w:hAnsi="Arial" w:cs="Arial"/>
+                <w:b/>
+                <w:sz w:val="24"/>
+                <w:szCs w:val="24"/>
+                <w:lang w:val="sv-SE"/>
+              </w:rPr>
+              <w:br/>
+            </w:r>
+            <w:r>
+              <w:rPr>
+                <w:rFonts w:ascii="Arial" w:eastAsia="Arial" w:hAnsi="Arial" w:cs="Arial"/>
+                <w:bCs/>
+                <w:sz w:val="24"/>
+                <w:szCs w:val="24"/>
+              </w:rPr>
+              <w:t>Hasil simulasi menjadi dasar untuk menyempurnakan konfigurasi server sebelum implementasi penuh.</w:t>
+            </w:r>
+          </w:p>
+        </w:tc>
+        <w:tc>
+          <w:tcPr>
+            <w:tcW w:w="0" w:type="auto"/>
+            <w:tcBorders>
+              <w:top w:val="single" w:sz="3" w:space="0" w:color="000000"/>
+              <w:left w:val="single" w:sz="3" w:space="0" w:color="000000"/>
+              <w:bottom w:val="single" w:sz="3" w:space="0" w:color="000000"/>
+              <w:right w:val="single" w:sz="3" w:space="0" w:color="000000"/>
+            </w:tcBorders>
+            <w:vAlign w:val="center"/>
+          </w:tcPr>
+          <w:p>
+            <w:pPr>
+              <w:rPr>
+                <w:rFonts w:ascii="Arial" w:eastAsia="Arial" w:hAnsi="Arial" w:cs="Arial"/>
+                <w:sz w:val="24"/>
+                <w:szCs w:val="24"/>
+              </w:rPr>
+            </w:pPr>
+            <w:r>
+              <w:rPr>
+                <w:rFonts w:ascii="Arial" w:eastAsia="Arial" w:hAnsi="Arial" w:cs="Arial"/>
+                <w:sz w:val="24"/>
+                <w:szCs w:val="24"/>
+              </w:rPr>
+              <w:t>Simulasi sebagai langkah validasi</w:t>
+            </w:r>
+          </w:p>
+        </w:tc>
+        <w:tc>
+          <w:tcPr>
+            <w:tcW w:w="0" w:type="auto"/>
+            <w:tcBorders>
+              <w:top w:val="single" w:sz="3" w:space="0" w:color="000000"/>
+              <w:left w:val="single" w:sz="3" w:space="0" w:color="000000"/>
+              <w:bottom w:val="single" w:sz="3" w:space="0" w:color="000000"/>
+              <w:right w:val="single" w:sz="3" w:space="0" w:color="000000"/>
+            </w:tcBorders>
+            <w:vAlign w:val="center"/>
+          </w:tcPr>
+          <w:p>
+            <w:pPr>
+              <w:spacing w:line="241" w:lineRule="auto"/>
+              <w:ind w:right="60"/>
+              <w:rPr>
+                <w:rFonts w:ascii="Arial" w:eastAsia="Arial" w:hAnsi="Arial" w:cs="Arial"/>
+                <w:sz w:val="24"/>
+                <w:szCs w:val="24"/>
+              </w:rPr>
+            </w:pPr>
+            <w:r>
+              <w:rPr>
+                <w:rFonts w:ascii="Arial" w:eastAsia="Arial" w:hAnsi="Arial" w:cs="Arial"/>
+                <w:sz w:val="24"/>
+                <w:szCs w:val="24"/>
+              </w:rPr>
+              <w:t xml:space="preserve">Setelah selesai membuat </w:t>
+            </w:r>
+            <w:r>
+              <w:rPr>
+                <w:rFonts w:ascii="Arial" w:eastAsia="Arial" w:hAnsi="Arial" w:cs="Arial"/>
+                <w:i/>
+                <w:iCs/>
+                <w:sz w:val="24"/>
+                <w:szCs w:val="24"/>
+              </w:rPr>
+              <w:t>local server</w:t>
+            </w:r>
+            <w:r>
+              <w:rPr>
+                <w:rFonts w:ascii="Arial" w:eastAsia="Arial" w:hAnsi="Arial" w:cs="Arial"/>
+                <w:sz w:val="24"/>
+                <w:szCs w:val="24"/>
+              </w:rPr>
+              <w:t xml:space="preserve">, </w:t>
+            </w:r>
+            <w:r>
+              <w:rPr>
+                <w:rFonts w:ascii="Arial" w:eastAsia="Arial" w:hAnsi="Arial" w:cs="Arial"/>
+                <w:sz w:val="24"/>
+                <w:szCs w:val="24"/>
+              </w:rPr>
+              <w:t xml:space="preserve">kegiatan selanjutnya adalah melakukan simulasi penggunaan </w:t>
+            </w:r>
+            <w:r>
+              <w:rPr>
+                <w:rFonts w:ascii="Arial" w:eastAsia="Arial" w:hAnsi="Arial" w:cs="Arial"/>
+                <w:i/>
+                <w:iCs/>
+                <w:sz w:val="24"/>
+                <w:szCs w:val="24"/>
+              </w:rPr>
+              <w:t>local server</w:t>
+            </w:r>
+            <w:r>
+              <w:rPr>
+                <w:rFonts w:ascii="Arial" w:eastAsia="Arial" w:hAnsi="Arial" w:cs="Arial"/>
+                <w:sz w:val="24"/>
+                <w:szCs w:val="24"/>
+              </w:rPr>
+              <w:t>.</w:t>
+            </w:r>
+            <w:r>
+              <w:rPr>
+                <w:rFonts w:ascii="Arial" w:eastAsia="Arial" w:hAnsi="Arial" w:cs="Arial"/>
+                <w:sz w:val="24"/>
+                <w:szCs w:val="24"/>
+              </w:rPr>
+              <w:t xml:space="preserve"> Simulasi dimulai dengan melakukan </w:t>
+            </w:r>
+            <w:r>
+              <w:rPr>
+                <w:rFonts w:ascii="Arial" w:eastAsia="Arial" w:hAnsi="Arial" w:cs="Arial"/>
+                <w:i/>
+                <w:iCs/>
+                <w:sz w:val="24"/>
+                <w:szCs w:val="24"/>
+              </w:rPr>
+              <w:t>login</w:t>
+            </w:r>
+            <w:r>
+              <w:rPr>
+                <w:rFonts w:ascii="Arial" w:eastAsia="Arial" w:hAnsi="Arial" w:cs="Arial"/>
+                <w:sz w:val="24"/>
+                <w:szCs w:val="24"/>
+              </w:rPr>
+              <w:t xml:space="preserve"> ke </w:t>
+            </w:r>
+            <w:r>
+              <w:rPr>
+                <w:rFonts w:ascii="Arial" w:eastAsia="Arial" w:hAnsi="Arial" w:cs="Arial"/>
+                <w:i/>
+                <w:iCs/>
+                <w:sz w:val="24"/>
+                <w:szCs w:val="24"/>
+              </w:rPr>
+              <w:t>server</w:t>
+            </w:r>
+            <w:r>
+              <w:rPr>
+                <w:rFonts w:ascii="Arial" w:eastAsia="Arial" w:hAnsi="Arial" w:cs="Arial"/>
+                <w:sz w:val="24"/>
+                <w:szCs w:val="24"/>
+              </w:rPr>
+              <w:t>.</w:t>
+            </w:r>
+            <w:r>
+              <w:rPr>
+                <w:rFonts w:ascii="Arial" w:eastAsia="Arial" w:hAnsi="Arial" w:cs="Arial"/>
+                <w:sz w:val="24"/>
+                <w:szCs w:val="24"/>
+              </w:rPr>
+              <w:t xml:space="preserve"> Setelah </w:t>
+            </w:r>
+            <w:r>
+              <w:rPr>
+                <w:rFonts w:ascii="Arial" w:eastAsia="Arial" w:hAnsi="Arial" w:cs="Arial"/>
+                <w:i/>
+                <w:iCs/>
+                <w:sz w:val="24"/>
+                <w:szCs w:val="24"/>
+              </w:rPr>
+              <w:t>login</w:t>
+            </w:r>
+            <w:r>
+              <w:rPr>
+                <w:rFonts w:ascii="Arial" w:eastAsia="Arial" w:hAnsi="Arial" w:cs="Arial"/>
+                <w:i/>
+                <w:iCs/>
+                <w:sz w:val="24"/>
+                <w:szCs w:val="24"/>
+              </w:rPr>
+              <w:t xml:space="preserve"> </w:t>
+            </w:r>
+            <w:r>
+              <w:rPr>
+                <w:rFonts w:ascii="Arial" w:eastAsia="Arial" w:hAnsi="Arial" w:cs="Arial"/>
+                <w:sz w:val="24"/>
+                <w:szCs w:val="24"/>
+              </w:rPr>
+              <w:t xml:space="preserve">berhasil, dilanjutkan dengan mengunggah </w:t>
+            </w:r>
+            <w:r>
+              <w:rPr>
+                <w:rFonts w:ascii="Arial" w:eastAsia="Arial" w:hAnsi="Arial" w:cs="Arial"/>
+                <w:i/>
+                <w:iCs/>
+                <w:sz w:val="24"/>
+                <w:szCs w:val="24"/>
+              </w:rPr>
+              <w:t>file</w:t>
+            </w:r>
+            <w:r>
+              <w:rPr>
+                <w:rFonts w:ascii="Arial" w:eastAsia="Arial" w:hAnsi="Arial" w:cs="Arial"/>
+                <w:sz w:val="24"/>
+                <w:szCs w:val="24"/>
+              </w:rPr>
+              <w:t xml:space="preserve">. Setelah </w:t>
+            </w:r>
+            <w:r>
+              <w:rPr>
+                <w:rFonts w:ascii="Arial" w:eastAsia="Arial" w:hAnsi="Arial" w:cs="Arial"/>
+                <w:sz w:val="24"/>
+                <w:szCs w:val="24"/>
+              </w:rPr>
+              <w:t xml:space="preserve">itu </w:t>
+            </w:r>
+            <w:r>
+              <w:rPr>
+                <w:rFonts w:ascii="Arial" w:eastAsia="Arial" w:hAnsi="Arial" w:cs="Arial"/>
+                <w:i/>
+                <w:iCs/>
+                <w:sz w:val="24"/>
+                <w:szCs w:val="24"/>
+              </w:rPr>
+              <w:t>file</w:t>
+            </w:r>
+            <w:r>
+              <w:rPr>
+                <w:rFonts w:ascii="Arial" w:eastAsia="Arial" w:hAnsi="Arial" w:cs="Arial"/>
+                <w:sz w:val="24"/>
+                <w:szCs w:val="24"/>
+              </w:rPr>
+              <w:t xml:space="preserve"> tadi dicek di komputer lain, untuk memastikan bahwa </w:t>
+            </w:r>
+            <w:r>
+              <w:rPr>
+                <w:rFonts w:ascii="Arial" w:eastAsia="Arial" w:hAnsi="Arial" w:cs="Arial"/>
+                <w:i/>
+                <w:iCs/>
+                <w:sz w:val="24"/>
+                <w:szCs w:val="24"/>
+              </w:rPr>
+              <w:t>file</w:t>
+            </w:r>
+            <w:r>
+              <w:rPr>
+                <w:rFonts w:ascii="Arial" w:eastAsia="Arial" w:hAnsi="Arial" w:cs="Arial"/>
+                <w:sz w:val="24"/>
+                <w:szCs w:val="24"/>
+              </w:rPr>
+              <w:t xml:space="preserve"> tersebut sudah benar-benar terunggah di </w:t>
+            </w:r>
+            <w:r>
+              <w:rPr>
+                <w:rFonts w:ascii="Arial" w:eastAsia="Arial" w:hAnsi="Arial" w:cs="Arial"/>
+                <w:i/>
+                <w:iCs/>
+                <w:sz w:val="24"/>
+                <w:szCs w:val="24"/>
+              </w:rPr>
+              <w:t>local server</w:t>
+            </w:r>
+            <w:r>
+              <w:rPr>
+                <w:rFonts w:ascii="Arial" w:eastAsia="Arial" w:hAnsi="Arial" w:cs="Arial"/>
+                <w:sz w:val="24"/>
+                <w:szCs w:val="24"/>
+              </w:rPr>
+              <w:t>.</w:t>
+            </w:r>
+          </w:p>
+          <w:p>
+            <w:pPr>
+              <w:spacing w:line="241" w:lineRule="auto"/>
+              <w:ind w:right="60"/>
+              <w:rPr>
+                <w:rFonts w:ascii="Arial" w:eastAsia="Arial" w:hAnsi="Arial" w:cs="Arial"/>
+                <w:sz w:val="24"/>
+                <w:szCs w:val="24"/>
+              </w:rPr>
+            </w:pPr>
+            <w:r>
+              <w:rPr>
+                <w:rFonts w:ascii="Arial" w:eastAsia="Arial" w:hAnsi="Arial" w:cs="Arial"/>
+                <w:b/>
+                <w:bCs/>
+                <w:sz w:val="24"/>
+                <w:szCs w:val="24"/>
+              </w:rPr>
+              <w:t>Output:</w:t>
+            </w:r>
+            <w:r>
+              <w:rPr>
+                <w:rFonts w:ascii="Arial" w:eastAsia="Arial" w:hAnsi="Arial" w:cs="Arial"/>
+                <w:b/>
+                <w:bCs/>
+                <w:sz w:val="24"/>
+                <w:szCs w:val="24"/>
+              </w:rPr>
+              <w:t xml:space="preserve"> </w:t>
+            </w:r>
+            <w:r>
+              <w:rPr>
+                <w:rFonts w:ascii="Arial" w:eastAsia="Arial" w:hAnsi="Arial" w:cs="Arial"/>
+                <w:sz w:val="24"/>
+                <w:szCs w:val="24"/>
+              </w:rPr>
+              <w:t xml:space="preserve">Hasil dari kegiatan ini adalah draf alur petunjuk teknis penggunaan </w:t>
+            </w:r>
+            <w:r>
+              <w:rPr>
+                <w:rFonts w:ascii="Arial" w:eastAsia="Arial" w:hAnsi="Arial" w:cs="Arial"/>
+                <w:i/>
+                <w:iCs/>
+                <w:sz w:val="24"/>
+                <w:szCs w:val="24"/>
+              </w:rPr>
+              <w:t>local server</w:t>
+            </w:r>
+            <w:r>
+              <w:rPr>
+                <w:rFonts w:ascii="Arial" w:eastAsia="Arial" w:hAnsi="Arial" w:cs="Arial"/>
+                <w:sz w:val="24"/>
+                <w:szCs w:val="24"/>
+              </w:rPr>
+              <w:t>.</w:t>
+            </w:r>
+          </w:p>
+        </w:tc>
+      </w:tr>
+      <w:tr>
+        <w:trPr>
+          <w:trHeight w:val="2557"/>
+        </w:trPr>
+        <w:tc>
+          <w:tcPr>
+            <w:tcW w:w="0" w:type="auto"/>
+            <w:tcBorders>
+              <w:top w:val="single" w:sz="3" w:space="0" w:color="000000"/>
+              <w:left w:val="single" w:sz="3" w:space="0" w:color="000000"/>
+              <w:bottom w:val="single" w:sz="3" w:space="0" w:color="000000"/>
+              <w:right w:val="single" w:sz="3" w:space="0" w:color="000000"/>
+            </w:tcBorders>
+            <w:vAlign w:val="center"/>
+          </w:tcPr>
+          <w:p>
+            <w:pPr>
+              <w:rPr>
+                <w:rFonts w:ascii="Arial" w:eastAsia="Arial" w:hAnsi="Arial" w:cs="Arial"/>
+                <w:sz w:val="24"/>
+                <w:szCs w:val="24"/>
+              </w:rPr>
+            </w:pPr>
+            <w:r>
+              <w:rPr>
+                <w:rFonts w:ascii="Arial" w:eastAsia="Arial" w:hAnsi="Arial" w:cs="Arial"/>
+                <w:sz w:val="24"/>
+                <w:szCs w:val="24"/>
+              </w:rPr>
+              <w:t>3.</w:t>
+            </w:r>
+          </w:p>
+        </w:tc>
+        <w:tc>
+          <w:tcPr>
+            <w:tcW w:w="0" w:type="auto"/>
+            <w:tcBorders>
+              <w:top w:val="single" w:sz="3" w:space="0" w:color="000000"/>
+              <w:left w:val="single" w:sz="3" w:space="0" w:color="000000"/>
+              <w:bottom w:val="single" w:sz="3" w:space="0" w:color="000000"/>
+              <w:right w:val="single" w:sz="3" w:space="0" w:color="000000"/>
+            </w:tcBorders>
+            <w:vAlign w:val="center"/>
+          </w:tcPr>
+          <w:p>
+            <w:pPr>
+              <w:spacing w:line="241" w:lineRule="auto"/>
+              <w:rPr>
+                <w:rFonts w:ascii="Arial" w:eastAsia="Arial" w:hAnsi="Arial" w:cs="Arial"/>
+                <w:i/>
+                <w:iCs/>
+                <w:sz w:val="24"/>
+                <w:szCs w:val="24"/>
+                <w:lang w:val="sv-SE"/>
+              </w:rPr>
+            </w:pPr>
+            <w:r>
+              <w:rPr>
+                <w:rFonts w:ascii="Arial" w:eastAsia="Arial" w:hAnsi="Arial" w:cs="Arial"/>
+                <w:sz w:val="24"/>
+                <w:szCs w:val="24"/>
+                <w:lang w:val="sv-SE"/>
+              </w:rPr>
+              <w:t xml:space="preserve">Melakukan sosialisasi petunjuk teknis penggunaan </w:t>
+            </w:r>
+            <w:r>
+              <w:rPr>
+                <w:rFonts w:ascii="Arial" w:eastAsia="Arial" w:hAnsi="Arial" w:cs="Arial"/>
+                <w:i/>
+                <w:iCs/>
+                <w:sz w:val="24"/>
+                <w:szCs w:val="24"/>
+                <w:lang w:val="sv-SE"/>
+              </w:rPr>
+              <w:t>local server</w:t>
+            </w:r>
+          </w:p>
+        </w:tc>
+        <w:tc>
+          <w:tcPr>
+            <w:tcW w:w="0" w:type="auto"/>
+            <w:tcBorders>
+              <w:top w:val="single" w:sz="3" w:space="0" w:color="000000"/>
+              <w:left w:val="single" w:sz="3" w:space="0" w:color="000000"/>
+              <w:bottom w:val="single" w:sz="3" w:space="0" w:color="000000"/>
+              <w:right w:val="single" w:sz="3" w:space="0" w:color="000000"/>
+            </w:tcBorders>
+            <w:vAlign w:val="center"/>
+          </w:tcPr>
+          <w:p>
+            <w:pPr>
+              <w:rPr>
+                <w:rFonts w:ascii="Arial" w:eastAsia="Arial" w:hAnsi="Arial" w:cs="Arial"/>
+                <w:bCs/>
+                <w:sz w:val="24"/>
+                <w:szCs w:val="24"/>
+                <w:lang w:val="sv-SE"/>
+              </w:rPr>
+            </w:pPr>
+            <w:r>
+              <w:rPr>
+                <w:rFonts w:ascii="Arial" w:eastAsia="Arial" w:hAnsi="Arial" w:cs="Arial"/>
+                <w:b/>
+                <w:sz w:val="24"/>
+                <w:szCs w:val="24"/>
+                <w:lang w:val="sv-SE"/>
+              </w:rPr>
+              <w:t>Berorientasi Pelayanan</w:t>
+            </w:r>
+            <w:r>
+              <w:rPr>
+                <w:rFonts w:ascii="Arial" w:eastAsia="Arial" w:hAnsi="Arial" w:cs="Arial"/>
+                <w:b/>
+                <w:sz w:val="24"/>
+                <w:szCs w:val="24"/>
+                <w:lang w:val="sv-SE"/>
+              </w:rPr>
+              <w:br/>
+            </w:r>
+            <w:r>
+              <w:rPr>
+                <w:rFonts w:ascii="Arial" w:eastAsia="Arial" w:hAnsi="Arial" w:cs="Arial"/>
+                <w:bCs/>
+                <w:sz w:val="24"/>
+                <w:szCs w:val="24"/>
+              </w:rPr>
+              <w:t>Sosialisasi memastikan semua personel dapat mengakses dan memanfaatkan server dengan optimal</w:t>
+            </w:r>
+            <w:r>
+              <w:rPr>
+                <w:rFonts w:ascii="Arial" w:eastAsia="Arial" w:hAnsi="Arial" w:cs="Arial"/>
+                <w:bCs/>
+                <w:sz w:val="24"/>
+                <w:szCs w:val="24"/>
+              </w:rPr>
+              <w:t xml:space="preserve"> untuk kebutuhan pekerjaan.</w:t>
+            </w:r>
+          </w:p>
+          <w:p>
+            <w:pPr>
+              <w:rPr>
+                <w:rFonts w:ascii="Arial" w:eastAsia="Arial" w:hAnsi="Arial" w:cs="Arial"/>
+                <w:bCs/>
+                <w:sz w:val="24"/>
+                <w:szCs w:val="24"/>
+                <w:lang w:val="sv-SE"/>
+              </w:rPr>
+            </w:pPr>
+            <w:r>
+              <w:rPr>
+                <w:rFonts w:ascii="Arial" w:eastAsia="Arial" w:hAnsi="Arial" w:cs="Arial"/>
+                <w:b/>
+                <w:sz w:val="24"/>
+                <w:szCs w:val="24"/>
+                <w:lang w:val="sv-SE"/>
+              </w:rPr>
+              <w:t>Kompeten</w:t>
+            </w:r>
+            <w:r>
+              <w:rPr>
+                <w:rFonts w:ascii="Arial" w:eastAsia="Arial" w:hAnsi="Arial" w:cs="Arial"/>
+                <w:b/>
+                <w:sz w:val="24"/>
+                <w:szCs w:val="24"/>
+                <w:lang w:val="sv-SE"/>
+              </w:rPr>
+              <w:br/>
+            </w:r>
+            <w:r>
+              <w:rPr>
+                <w:rFonts w:ascii="Arial" w:eastAsia="Arial" w:hAnsi="Arial" w:cs="Arial"/>
+                <w:bCs/>
+                <w:sz w:val="24"/>
+                <w:szCs w:val="24"/>
+              </w:rPr>
+              <w:t xml:space="preserve">Penyelenggaraan sosialisasi menunjukkan penguasaan materi teknis dan kemampuan </w:t>
+            </w:r>
+            <w:r>
+              <w:rPr>
+                <w:rFonts w:ascii="Arial" w:eastAsia="Arial" w:hAnsi="Arial" w:cs="Arial"/>
+                <w:bCs/>
+                <w:i/>
+                <w:iCs/>
+                <w:sz w:val="24"/>
+                <w:szCs w:val="24"/>
+              </w:rPr>
+              <w:t>transfer knowledge</w:t>
+            </w:r>
+            <w:r>
+              <w:rPr>
+                <w:rFonts w:ascii="Arial" w:eastAsia="Arial" w:hAnsi="Arial" w:cs="Arial"/>
+                <w:bCs/>
+                <w:sz w:val="24"/>
+                <w:szCs w:val="24"/>
+              </w:rPr>
+              <w:t xml:space="preserve"> yang efektif</w:t>
+            </w:r>
+            <w:r>
+              <w:rPr>
+                <w:rFonts w:ascii="Arial" w:eastAsia="Arial" w:hAnsi="Arial" w:cs="Arial"/>
+                <w:bCs/>
+                <w:sz w:val="24"/>
+                <w:szCs w:val="24"/>
+              </w:rPr>
+              <w:t>.</w:t>
+            </w:r>
+          </w:p>
+          <w:p>
+            <w:pPr>
+              <w:rPr>
+                <w:rFonts w:ascii="Arial" w:eastAsia="Arial" w:hAnsi="Arial" w:cs="Arial"/>
+                <w:bCs/>
+                <w:sz w:val="24"/>
+                <w:szCs w:val="24"/>
+                <w:lang w:val="sv-SE"/>
+              </w:rPr>
+            </w:pPr>
+            <w:r>
+              <w:rPr>
+                <w:rFonts w:ascii="Arial" w:eastAsia="Arial" w:hAnsi="Arial" w:cs="Arial"/>
+                <w:b/>
+                <w:sz w:val="24"/>
+                <w:szCs w:val="24"/>
+                <w:lang w:val="sv-SE"/>
+              </w:rPr>
+              <w:t>Harmonis</w:t>
+            </w:r>
+            <w:r>
+              <w:rPr>
+                <w:rFonts w:ascii="Arial" w:eastAsia="Arial" w:hAnsi="Arial" w:cs="Arial"/>
+                <w:b/>
+                <w:sz w:val="24"/>
+                <w:szCs w:val="24"/>
+                <w:lang w:val="sv-SE"/>
+              </w:rPr>
+              <w:br/>
+            </w:r>
+            <w:r>
+              <w:rPr>
+                <w:rFonts w:ascii="Arial" w:eastAsia="Arial" w:hAnsi="Arial" w:cs="Arial"/>
+                <w:bCs/>
+                <w:sz w:val="24"/>
+                <w:szCs w:val="24"/>
+              </w:rPr>
+              <w:t>Kegiatan sosialisasi menciptakan kesamaan persepsi dan meminimalkan kesalahpahaman dalam penggunaan teknologi</w:t>
+            </w:r>
+            <w:r>
+              <w:rPr>
+                <w:rFonts w:ascii="Arial" w:eastAsia="Arial" w:hAnsi="Arial" w:cs="Arial"/>
+                <w:bCs/>
+                <w:sz w:val="24"/>
+                <w:szCs w:val="24"/>
+              </w:rPr>
+              <w:t>.</w:t>
+            </w:r>
+          </w:p>
+          <w:p>
+            <w:pPr>
+              <w:rPr>
+                <w:rFonts w:ascii="Arial" w:eastAsia="Arial" w:hAnsi="Arial" w:cs="Arial"/>
+                <w:bCs/>
+                <w:sz w:val="24"/>
+                <w:szCs w:val="24"/>
+                <w:lang w:val="sv-SE"/>
+              </w:rPr>
+            </w:pPr>
+            <w:r>
+              <w:rPr>
+                <w:rFonts w:ascii="Arial" w:eastAsia="Arial" w:hAnsi="Arial" w:cs="Arial"/>
+                <w:b/>
+                <w:sz w:val="24"/>
+                <w:szCs w:val="24"/>
+                <w:lang w:val="sv-SE"/>
+              </w:rPr>
+              <w:t>Kolaboratif</w:t>
+            </w:r>
+            <w:r>
+              <w:rPr>
+                <w:rFonts w:ascii="Arial" w:eastAsia="Arial" w:hAnsi="Arial" w:cs="Arial"/>
+                <w:b/>
+                <w:sz w:val="24"/>
+                <w:szCs w:val="24"/>
+                <w:lang w:val="sv-SE"/>
+              </w:rPr>
+              <w:br/>
+            </w:r>
+            <w:r>
+              <w:rPr>
+                <w:rFonts w:ascii="Arial" w:eastAsia="Arial" w:hAnsi="Arial" w:cs="Arial"/>
+                <w:bCs/>
+                <w:sz w:val="24"/>
+                <w:szCs w:val="24"/>
+              </w:rPr>
+              <w:t>Sosialisasi mendorong kerja sama dalam pemanfaatan infrastruktur digital secara bersama-sama</w:t>
+            </w:r>
+            <w:r>
+              <w:rPr>
+                <w:rFonts w:ascii="Arial" w:eastAsia="Arial" w:hAnsi="Arial" w:cs="Arial"/>
+                <w:bCs/>
+                <w:sz w:val="24"/>
+                <w:szCs w:val="24"/>
+              </w:rPr>
+              <w:t>.</w:t>
+            </w:r>
+          </w:p>
+        </w:tc>
+        <w:tc>
+          <w:tcPr>
+            <w:tcW w:w="0" w:type="auto"/>
+            <w:tcBorders>
+              <w:top w:val="single" w:sz="3" w:space="0" w:color="000000"/>
+              <w:left w:val="single" w:sz="3" w:space="0" w:color="000000"/>
+              <w:bottom w:val="single" w:sz="3" w:space="0" w:color="000000"/>
+              <w:right w:val="single" w:sz="3" w:space="0" w:color="000000"/>
+            </w:tcBorders>
+            <w:vAlign w:val="center"/>
+          </w:tcPr>
+          <w:p>
+            <w:pPr>
+              <w:ind w:left="20"/>
+              <w:rPr>
+                <w:rFonts w:ascii="Arial" w:eastAsia="Arial" w:hAnsi="Arial" w:cs="Arial"/>
+                <w:bCs/>
+                <w:sz w:val="24"/>
+                <w:szCs w:val="24"/>
+                <w:lang w:val="sv-SE"/>
+              </w:rPr>
+            </w:pPr>
+            <w:r>
+              <w:rPr>
+                <w:rFonts w:ascii="Arial" w:eastAsia="Arial" w:hAnsi="Arial" w:cs="Arial"/>
+                <w:b/>
+                <w:sz w:val="24"/>
+                <w:szCs w:val="24"/>
+                <w:lang w:val="sv-SE"/>
+              </w:rPr>
+              <w:t>Manajemen ASN</w:t>
+            </w:r>
+            <w:r>
+              <w:rPr>
+                <w:rFonts w:ascii="Arial" w:eastAsia="Arial" w:hAnsi="Arial" w:cs="Arial"/>
+                <w:b/>
+                <w:sz w:val="24"/>
+                <w:szCs w:val="24"/>
+                <w:lang w:val="sv-SE"/>
+              </w:rPr>
+              <w:br/>
+            </w:r>
+            <w:r>
+              <w:rPr>
+                <w:rFonts w:ascii="Arial" w:eastAsia="Arial" w:hAnsi="Arial" w:cs="Arial"/>
+                <w:bCs/>
+                <w:sz w:val="24"/>
+                <w:szCs w:val="24"/>
+              </w:rPr>
+              <w:t>Sosialisasi merupakan bentuk pelatihan untuk meningkatkan kapasitas ASN dalam penguasaan teknologi</w:t>
+            </w:r>
+            <w:r>
+              <w:rPr>
+                <w:rFonts w:ascii="Arial" w:eastAsia="Arial" w:hAnsi="Arial" w:cs="Arial"/>
+                <w:bCs/>
+                <w:sz w:val="24"/>
+                <w:szCs w:val="24"/>
+              </w:rPr>
+              <w:t>.</w:t>
+            </w:r>
+          </w:p>
+          <w:p>
+            <w:pPr>
+              <w:ind w:left="20"/>
+              <w:rPr>
+                <w:rFonts w:ascii="Arial" w:eastAsia="Arial" w:hAnsi="Arial" w:cs="Arial"/>
+                <w:bCs/>
+                <w:sz w:val="24"/>
+                <w:szCs w:val="24"/>
+                <w:lang w:val="sv-SE"/>
+              </w:rPr>
+            </w:pPr>
+            <w:r>
+              <w:rPr>
+                <w:rFonts w:ascii="Arial" w:eastAsia="Arial" w:hAnsi="Arial" w:cs="Arial"/>
+                <w:b/>
+                <w:sz w:val="24"/>
+                <w:szCs w:val="24"/>
+                <w:lang w:val="sv-SE"/>
+              </w:rPr>
+              <w:t>Smart ASN</w:t>
+            </w:r>
+            <w:r>
+              <w:rPr>
+                <w:rFonts w:ascii="Arial" w:eastAsia="Arial" w:hAnsi="Arial" w:cs="Arial"/>
+                <w:b/>
+                <w:sz w:val="24"/>
+                <w:szCs w:val="24"/>
+                <w:lang w:val="sv-SE"/>
+              </w:rPr>
+              <w:br/>
+            </w:r>
+            <w:r>
+              <w:rPr>
+                <w:rFonts w:ascii="Arial" w:eastAsia="Arial" w:hAnsi="Arial" w:cs="Arial"/>
+                <w:bCs/>
+                <w:sz w:val="24"/>
+                <w:szCs w:val="24"/>
+              </w:rPr>
+              <w:t xml:space="preserve">Sosialisasi merupakan bagian </w:t>
+            </w:r>
+            <w:r>
+              <w:rPr>
+                <w:rFonts w:ascii="Arial" w:eastAsia="Arial" w:hAnsi="Arial" w:cs="Arial"/>
+                <w:bCs/>
+                <w:sz w:val="24"/>
+                <w:szCs w:val="24"/>
+              </w:rPr>
+              <w:t>esensial</w:t>
+            </w:r>
+            <w:r>
+              <w:rPr>
+                <w:rFonts w:ascii="Arial" w:eastAsia="Arial" w:hAnsi="Arial" w:cs="Arial"/>
+                <w:bCs/>
+                <w:sz w:val="24"/>
+                <w:szCs w:val="24"/>
+              </w:rPr>
+              <w:t xml:space="preserve"> dari implementasi infrastruktur digital yang berkelanjutan</w:t>
+            </w:r>
+            <w:r>
+              <w:rPr>
+                <w:rFonts w:ascii="Arial" w:eastAsia="Arial" w:hAnsi="Arial" w:cs="Arial"/>
+                <w:bCs/>
+                <w:sz w:val="24"/>
+                <w:szCs w:val="24"/>
+              </w:rPr>
+              <w:t>.</w:t>
+            </w:r>
+          </w:p>
+        </w:tc>
+        <w:tc>
+          <w:tcPr>
+            <w:tcW w:w="0" w:type="auto"/>
+            <w:tcBorders>
+              <w:top w:val="single" w:sz="3" w:space="0" w:color="000000"/>
+              <w:left w:val="single" w:sz="3" w:space="0" w:color="000000"/>
+              <w:bottom w:val="single" w:sz="3" w:space="0" w:color="000000"/>
+              <w:right w:val="single" w:sz="3" w:space="0" w:color="000000"/>
+            </w:tcBorders>
+            <w:vAlign w:val="center"/>
+          </w:tcPr>
+          <w:p>
+            <w:pPr>
+              <w:rPr>
+                <w:rFonts w:ascii="Arial" w:eastAsia="Arial" w:hAnsi="Arial" w:cs="Arial"/>
+                <w:sz w:val="24"/>
+                <w:szCs w:val="24"/>
+              </w:rPr>
+            </w:pPr>
+            <w:r>
+              <w:rPr>
+                <w:rFonts w:ascii="Arial" w:eastAsia="Arial" w:hAnsi="Arial" w:cs="Arial"/>
+                <w:sz w:val="24"/>
+                <w:szCs w:val="24"/>
+              </w:rPr>
+              <w:t>Koordinasi dan s</w:t>
+            </w:r>
+            <w:r>
+              <w:rPr>
+                <w:rFonts w:ascii="Arial" w:eastAsia="Arial" w:hAnsi="Arial" w:cs="Arial"/>
+                <w:sz w:val="24"/>
+                <w:szCs w:val="24"/>
+              </w:rPr>
+              <w:t>osialisasi dengan personel terkait</w:t>
+            </w:r>
+          </w:p>
+        </w:tc>
+        <w:tc>
+          <w:tcPr>
+            <w:tcW w:w="0" w:type="auto"/>
+            <w:tcBorders>
+              <w:top w:val="single" w:sz="3" w:space="0" w:color="000000"/>
+              <w:left w:val="single" w:sz="3" w:space="0" w:color="000000"/>
+              <w:bottom w:val="single" w:sz="3" w:space="0" w:color="000000"/>
+              <w:right w:val="single" w:sz="3" w:space="0" w:color="000000"/>
+            </w:tcBorders>
+            <w:vAlign w:val="center"/>
+          </w:tcPr>
+          <w:p>
+            <w:pPr>
+              <w:spacing w:line="241" w:lineRule="auto"/>
+              <w:ind w:right="60"/>
+              <w:rPr>
+                <w:rFonts w:ascii="Arial" w:eastAsia="Arial" w:hAnsi="Arial" w:cs="Arial"/>
+                <w:sz w:val="24"/>
+                <w:szCs w:val="24"/>
+              </w:rPr>
+            </w:pPr>
+            <w:r>
+              <w:rPr>
+                <w:rFonts w:ascii="Arial" w:eastAsia="Arial" w:hAnsi="Arial" w:cs="Arial"/>
+                <w:sz w:val="24"/>
+                <w:szCs w:val="24"/>
+              </w:rPr>
+              <w:t xml:space="preserve">Diawali dengan membuat alur final berdasarkan draf alur yang sudah dibuat setelah simulasi. Setelah alur final sudah selesai, akan dilakukan sosialisasi petunjuk teknis penggunaan </w:t>
+            </w:r>
+            <w:r>
+              <w:rPr>
+                <w:rFonts w:ascii="Arial" w:eastAsia="Arial" w:hAnsi="Arial" w:cs="Arial"/>
+                <w:i/>
+                <w:iCs/>
+                <w:sz w:val="24"/>
+                <w:szCs w:val="24"/>
+              </w:rPr>
+              <w:t>local server</w:t>
+            </w:r>
+            <w:r>
+              <w:rPr>
+                <w:rFonts w:ascii="Arial" w:eastAsia="Arial" w:hAnsi="Arial" w:cs="Arial"/>
+                <w:i/>
+                <w:iCs/>
+                <w:sz w:val="24"/>
+                <w:szCs w:val="24"/>
+              </w:rPr>
+              <w:t xml:space="preserve"> </w:t>
+            </w:r>
+            <w:r>
+              <w:rPr>
+                <w:rFonts w:ascii="Arial" w:eastAsia="Arial" w:hAnsi="Arial" w:cs="Arial"/>
+                <w:sz w:val="24"/>
+                <w:szCs w:val="24"/>
+              </w:rPr>
+              <w:t>kepada personel terkait guna menunjang kolaborasi.</w:t>
+            </w:r>
+          </w:p>
+          <w:p>
+            <w:pPr>
+              <w:spacing w:line="241" w:lineRule="auto"/>
+              <w:ind w:right="60"/>
+              <w:rPr>
+                <w:rFonts w:ascii="Arial" w:eastAsia="Arial" w:hAnsi="Arial" w:cs="Arial"/>
+                <w:sz w:val="24"/>
+                <w:szCs w:val="24"/>
+              </w:rPr>
+            </w:pPr>
+            <w:r>
+              <w:rPr>
+                <w:rFonts w:ascii="Arial" w:eastAsia="Arial" w:hAnsi="Arial" w:cs="Arial"/>
+                <w:b/>
+                <w:bCs/>
+                <w:sz w:val="24"/>
+                <w:szCs w:val="24"/>
+              </w:rPr>
+              <w:t xml:space="preserve">Output: </w:t>
+            </w:r>
+            <w:r>
+              <w:rPr>
+                <w:rFonts w:ascii="Arial" w:eastAsia="Arial" w:hAnsi="Arial" w:cs="Arial"/>
+                <w:sz w:val="24"/>
+                <w:szCs w:val="24"/>
+              </w:rPr>
+              <w:t xml:space="preserve">Kegiatan ini sukses jika meneghasilkan alur final </w:t>
+            </w:r>
+            <w:r>
+              <w:rPr>
+                <w:rFonts w:ascii="Arial" w:eastAsia="Arial" w:hAnsi="Arial" w:cs="Arial"/>
+                <w:sz w:val="24"/>
+                <w:szCs w:val="24"/>
+              </w:rPr>
+              <w:t xml:space="preserve">petunjuk teknis penggunaan </w:t>
+            </w:r>
+            <w:r>
+              <w:rPr>
+                <w:rFonts w:ascii="Arial" w:eastAsia="Arial" w:hAnsi="Arial" w:cs="Arial"/>
+                <w:i/>
+                <w:iCs/>
+                <w:sz w:val="24"/>
+                <w:szCs w:val="24"/>
+              </w:rPr>
+              <w:t>local server</w:t>
+            </w:r>
+            <w:r>
+              <w:rPr>
+                <w:rFonts w:ascii="Arial" w:eastAsia="Arial" w:hAnsi="Arial" w:cs="Arial"/>
+                <w:sz w:val="24"/>
+                <w:szCs w:val="24"/>
+              </w:rPr>
+              <w:t>.</w:t>
+            </w:r>
+          </w:p>
+        </w:tc>
+      </w:tr>
+    </w:tbl>
+    <w:p>
+      <w:pPr>
+        <w:spacing w:after="0" w:line="360" w:lineRule="auto"/>
+        <w:rPr>
+          <w:rFonts w:ascii="Arial" w:hAnsi="Arial" w:cs="Arial"/>
+          <w:b/>
+          <w:bCs/>
+          <w:sz w:val="24"/>
+          <w:szCs w:val="24"/>
+        </w:rPr>
+      </w:pPr>
+    </w:p>
+    <w:p>
+      <w:pPr>
+        <w:spacing w:after="0" w:line="360" w:lineRule="auto"/>
+        <w:rPr>
+          <w:rFonts w:ascii="Arial" w:hAnsi="Arial" w:cs="Arial"/>
+          <w:b/>
+          <w:bCs/>
+          <w:sz w:val="24"/>
+          <w:szCs w:val="24"/>
+        </w:rPr>
+      </w:pPr>
+    </w:p>
     <w:tbl>
       <w:tblPr>
         <w:tblStyle w:val="TableGrid"/>
@@ -9,715 +2134,297 @@
         <w:tblLook w:val="04A0" w:firstRow="1" w:lastRow="0" w:firstColumn="1" w:lastColumn="0" w:noHBand="0" w:noVBand="1"/>
       </w:tblPr>
       <w:tblGrid>
-        <w:gridCol w:w="475"/>
-        <w:gridCol w:w="2534"/>
-        <w:gridCol w:w="2655"/>
-        <w:gridCol w:w="2592"/>
-        <w:gridCol w:w="1561"/>
-        <w:gridCol w:w="4131"/>
+        <w:gridCol w:w="6713"/>
+        <w:gridCol w:w="6713"/>
       </w:tblGrid>
       <w:tr>
         <w:tc>
           <w:tcPr>
-            <w:tcW w:w="0" w:type="auto"/>
-            <w:vAlign w:val="center"/>
+            <w:tcW w:w="6713" w:type="dxa"/>
           </w:tcPr>
           <w:p>
             <w:pPr>
               <w:jc w:val="center"/>
-            </w:pPr>
-            <w:r>
-              <w:t>No</w:t>
+              <w:rPr>
+                <w:rFonts w:ascii="Arial" w:hAnsi="Arial" w:cs="Arial"/>
+                <w:sz w:val="24"/>
+                <w:szCs w:val="24"/>
+              </w:rPr>
+            </w:pPr>
+            <w:r>
+              <w:rPr>
+                <w:rFonts w:ascii="Arial" w:hAnsi="Arial" w:cs="Arial"/>
+                <w:sz w:val="24"/>
+                <w:szCs w:val="24"/>
+              </w:rPr>
+              <w:t>Mengetahui</w:t>
+            </w:r>
+          </w:p>
+          <w:p>
+            <w:pPr>
+              <w:jc w:val="center"/>
+              <w:rPr>
+                <w:rFonts w:ascii="Arial" w:hAnsi="Arial" w:cs="Arial"/>
+                <w:sz w:val="24"/>
+                <w:szCs w:val="24"/>
+              </w:rPr>
+            </w:pPr>
+            <w:r>
+              <w:rPr>
+                <w:rFonts w:ascii="Arial" w:hAnsi="Arial" w:cs="Arial"/>
+                <w:sz w:val="24"/>
+                <w:szCs w:val="24"/>
+              </w:rPr>
+              <w:t>Mentor,</w:t>
+            </w:r>
+          </w:p>
+          <w:p>
+            <w:pPr>
+              <w:jc w:val="center"/>
+              <w:rPr>
+                <w:rFonts w:ascii="Arial" w:hAnsi="Arial" w:cs="Arial"/>
+                <w:sz w:val="24"/>
+                <w:szCs w:val="24"/>
+              </w:rPr>
+            </w:pPr>
+          </w:p>
+          <w:p>
+            <w:pPr>
+              <w:jc w:val="center"/>
+              <w:rPr>
+                <w:rFonts w:ascii="Arial" w:hAnsi="Arial" w:cs="Arial"/>
+                <w:sz w:val="24"/>
+                <w:szCs w:val="24"/>
+              </w:rPr>
+            </w:pPr>
+          </w:p>
+          <w:p>
+            <w:pPr>
+              <w:jc w:val="center"/>
+              <w:rPr>
+                <w:rFonts w:ascii="Arial" w:hAnsi="Arial" w:cs="Arial"/>
+                <w:sz w:val="24"/>
+                <w:szCs w:val="24"/>
+              </w:rPr>
+            </w:pPr>
+          </w:p>
+          <w:p>
+            <w:pPr>
+              <w:jc w:val="center"/>
+              <w:rPr>
+                <w:rFonts w:ascii="Arial" w:hAnsi="Arial" w:cs="Arial"/>
+                <w:sz w:val="24"/>
+                <w:szCs w:val="24"/>
+              </w:rPr>
+            </w:pPr>
+            <w:r>
+              <w:rPr>
+                <w:rFonts w:ascii="Arial" w:hAnsi="Arial" w:cs="Arial"/>
+                <w:sz w:val="24"/>
+                <w:szCs w:val="24"/>
+              </w:rPr>
+              <w:t>Haerul Gazal, S.E.</w:t>
+            </w:r>
+          </w:p>
+          <w:p>
+            <w:pPr>
+              <w:jc w:val="center"/>
+              <w:rPr>
+                <w:rFonts w:ascii="Arial" w:hAnsi="Arial" w:cs="Arial"/>
+                <w:b/>
+                <w:bCs/>
+                <w:sz w:val="24"/>
+                <w:szCs w:val="24"/>
+              </w:rPr>
+            </w:pPr>
+            <w:r>
+              <w:rPr>
+                <w:rFonts w:ascii="Arial" w:hAnsi="Arial" w:cs="Arial"/>
+                <w:sz w:val="24"/>
+                <w:szCs w:val="24"/>
+              </w:rPr>
+              <w:t>Letkol Adm NRP</w:t>
+            </w:r>
+            <w:r>
+              <w:rPr>
+                <w:rFonts w:ascii="Arial" w:hAnsi="Arial" w:cs="Arial"/>
+                <w:sz w:val="24"/>
+                <w:szCs w:val="24"/>
+              </w:rPr>
+              <w:t xml:space="preserve"> </w:t>
+            </w:r>
+            <w:r>
+              <w:rPr>
+                <w:rFonts w:ascii="Arial" w:hAnsi="Arial" w:cs="Arial"/>
+                <w:sz w:val="24"/>
+                <w:szCs w:val="24"/>
+              </w:rPr>
+              <w:t>533715</w:t>
             </w:r>
           </w:p>
         </w:tc>
         <w:tc>
           <w:tcPr>
-            <w:tcW w:w="0" w:type="auto"/>
-            <w:vAlign w:val="center"/>
+            <w:tcW w:w="6713" w:type="dxa"/>
           </w:tcPr>
           <w:p>
             <w:pPr>
               <w:jc w:val="center"/>
-            </w:pPr>
-            <w:r>
-              <w:t>Kegiatan</w:t>
-            </w:r>
-          </w:p>
-        </w:tc>
-        <w:tc>
-          <w:tcPr>
-            <w:tcW w:w="0" w:type="auto"/>
-            <w:gridSpan w:val="2"/>
-            <w:vAlign w:val="center"/>
-          </w:tcPr>
+              <w:rPr>
+                <w:rFonts w:ascii="Arial" w:hAnsi="Arial" w:cs="Arial"/>
+                <w:sz w:val="24"/>
+                <w:szCs w:val="24"/>
+                <w:lang w:val="sv-SE"/>
+              </w:rPr>
+            </w:pPr>
+            <w:r>
+              <w:rPr>
+                <w:rFonts w:ascii="Arial" w:hAnsi="Arial" w:cs="Arial"/>
+                <w:sz w:val="24"/>
+                <w:szCs w:val="24"/>
+                <w:lang w:val="sv-SE"/>
+              </w:rPr>
+              <w:t>Jakarta, 10 Oktober 2025</w:t>
+            </w:r>
+          </w:p>
           <w:p>
             <w:pPr>
               <w:jc w:val="center"/>
-            </w:pPr>
-            <w:r>
-              <w:t>Nilai Dasar</w:t>
-            </w:r>
-          </w:p>
-        </w:tc>
-        <w:tc>
-          <w:tcPr>
-            <w:tcW w:w="0" w:type="auto"/>
-            <w:vAlign w:val="center"/>
-          </w:tcPr>
+              <w:rPr>
+                <w:rFonts w:ascii="Arial" w:hAnsi="Arial" w:cs="Arial"/>
+                <w:sz w:val="24"/>
+                <w:szCs w:val="24"/>
+                <w:lang w:val="sv-SE"/>
+              </w:rPr>
+            </w:pPr>
+            <w:r>
+              <w:rPr>
+                <w:rFonts w:ascii="Arial" w:hAnsi="Arial" w:cs="Arial"/>
+                <w:sz w:val="24"/>
+                <w:szCs w:val="24"/>
+                <w:lang w:val="sv-SE"/>
+              </w:rPr>
+              <w:t>Peserta,</w:t>
+            </w:r>
+          </w:p>
           <w:p>
             <w:pPr>
               <w:jc w:val="center"/>
-            </w:pPr>
-            <w:r>
-              <w:t>Teknik Implementasi</w:t>
-            </w:r>
-          </w:p>
-        </w:tc>
-        <w:tc>
-          <w:tcPr>
-            <w:tcW w:w="0" w:type="auto"/>
-            <w:vAlign w:val="center"/>
-          </w:tcPr>
+              <w:rPr>
+                <w:rFonts w:ascii="Arial" w:hAnsi="Arial" w:cs="Arial"/>
+                <w:sz w:val="24"/>
+                <w:szCs w:val="24"/>
+                <w:lang w:val="sv-SE"/>
+              </w:rPr>
+            </w:pPr>
+          </w:p>
           <w:p>
             <w:pPr>
               <w:jc w:val="center"/>
-            </w:pPr>
-            <w:r>
-              <w:t>Gambaran Kualitas Kegiatan (Proses dan Output)</w:t>
-            </w:r>
-          </w:p>
-        </w:tc>
-      </w:tr>
-      <w:tr>
-        <w:tc>
-          <w:tcPr>
-            <w:tcW w:w="0" w:type="auto"/>
-          </w:tcPr>
-          <w:p>
-            <w:r>
-              <w:t>1.</w:t>
-            </w:r>
-          </w:p>
-        </w:tc>
-        <w:tc>
-          <w:tcPr>
-            <w:tcW w:w="0" w:type="auto"/>
-          </w:tcPr>
-          <w:p>
-            <w:pPr>
-              <w:spacing w:after="0" w:line="240" w:lineRule="auto"/>
-              <w:rPr>
-                <w:rFonts w:eastAsia="Times New Roman"/>
-                <w:sz w:val="24"/>
-                <w:szCs w:val="24"/>
-                <w:lang w:val="sv-SE"/>
-              </w:rPr>
-            </w:pPr>
-            <w:r>
-              <w:rPr>
-                <w:rStyle w:val="fontstyle01"/>
-              </w:rPr>
-              <w:t>Berisi kegiatan</w:t>
-            </w:r>
-            <w:r>
-              <w:rPr>
-                <w:rStyle w:val="fontstyle01"/>
-              </w:rPr>
-              <w:t xml:space="preserve"> </w:t>
-            </w:r>
-            <w:r>
-              <w:rPr>
-                <w:rStyle w:val="fontstyle01"/>
-              </w:rPr>
-              <w:t>lanjutan berupa</w:t>
-            </w:r>
-            <w:r>
-              <w:rPr>
-                <w:rStyle w:val="fontstyle01"/>
-              </w:rPr>
-              <w:t xml:space="preserve"> </w:t>
-            </w:r>
-            <w:r>
-              <w:rPr>
-                <w:rStyle w:val="fontstyle01"/>
-              </w:rPr>
-              <w:t>peningkatan</w:t>
-            </w:r>
-            <w:r>
-              <w:rPr>
-                <w:rStyle w:val="fontstyle01"/>
-              </w:rPr>
-              <w:t xml:space="preserve"> </w:t>
-            </w:r>
-            <w:r>
-              <w:rPr>
-                <w:rStyle w:val="fontstyle01"/>
-              </w:rPr>
-              <w:t>ataupun</w:t>
-            </w:r>
-            <w:r>
-              <w:rPr>
-                <w:rStyle w:val="fontstyle01"/>
-              </w:rPr>
-              <w:t xml:space="preserve"> </w:t>
-            </w:r>
-            <w:r>
-              <w:rPr>
-                <w:rStyle w:val="fontstyle01"/>
-              </w:rPr>
-              <w:t>Pengembangan</w:t>
-            </w:r>
-            <w:r>
-              <w:rPr>
-                <w:rFonts w:ascii="ArialMT" w:hAnsi="ArialMT"/>
-                <w:color w:val="000000"/>
-                <w:sz w:val="20"/>
-                <w:szCs w:val="20"/>
-              </w:rPr>
-              <w:br/>
-            </w:r>
-            <w:r>
-              <w:rPr>
-                <w:rStyle w:val="fontstyle01"/>
-              </w:rPr>
-              <w:t>dari apa yang</w:t>
-            </w:r>
-            <w:r>
-              <w:rPr>
-                <w:rStyle w:val="fontstyle01"/>
-              </w:rPr>
-              <w:t xml:space="preserve"> </w:t>
-            </w:r>
-            <w:r>
-              <w:rPr>
-                <w:rStyle w:val="fontstyle01"/>
-              </w:rPr>
-              <w:t>sudah dikerjakan</w:t>
-            </w:r>
-            <w:r>
-              <w:rPr>
-                <w:rFonts w:ascii="ArialMT" w:hAnsi="ArialMT"/>
-                <w:color w:val="000000"/>
-                <w:sz w:val="20"/>
-                <w:szCs w:val="20"/>
-              </w:rPr>
-              <w:br/>
-            </w:r>
-            <w:r>
-              <w:rPr>
-                <w:rStyle w:val="fontstyle01"/>
-              </w:rPr>
-              <w:t>agar dapat</w:t>
-            </w:r>
-            <w:r>
-              <w:rPr>
-                <w:rStyle w:val="fontstyle01"/>
-              </w:rPr>
-              <w:t xml:space="preserve"> </w:t>
-            </w:r>
-            <w:r>
-              <w:rPr>
-                <w:rStyle w:val="fontstyle01"/>
-              </w:rPr>
-              <w:t>digunakan secara</w:t>
-            </w:r>
-            <w:r>
-              <w:rPr>
-                <w:rStyle w:val="fontstyle01"/>
-              </w:rPr>
-              <w:t xml:space="preserve"> </w:t>
-            </w:r>
-            <w:r>
-              <w:rPr>
-                <w:rStyle w:val="fontstyle01"/>
-              </w:rPr>
-              <w:t>berkelanjutan.</w:t>
-            </w:r>
-          </w:p>
-        </w:tc>
-        <w:tc>
-          <w:tcPr>
-            <w:tcW w:w="2655" w:type="dxa"/>
-          </w:tcPr>
-          <w:p>
-            <w:pPr>
-              <w:spacing w:after="0" w:line="240" w:lineRule="auto"/>
-              <w:rPr>
-                <w:rFonts w:eastAsia="Times New Roman"/>
-                <w:sz w:val="24"/>
-                <w:szCs w:val="24"/>
-                <w:lang w:val="sv-SE"/>
-              </w:rPr>
-            </w:pPr>
-            <w:r>
-              <w:rPr>
-                <w:rStyle w:val="fontstyle01"/>
-              </w:rPr>
-              <w:t>AGENDA II</w:t>
-            </w:r>
-            <w:r>
-              <w:rPr>
-                <w:rFonts w:ascii="Arial-BoldMT" w:hAnsi="Arial-BoldMT"/>
-                <w:b/>
-                <w:bCs/>
-                <w:color w:val="000000"/>
-                <w:sz w:val="20"/>
-                <w:szCs w:val="20"/>
-              </w:rPr>
-              <w:br/>
-            </w:r>
-            <w:r>
-              <w:rPr>
-                <w:rStyle w:val="fontstyle21"/>
-              </w:rPr>
-              <w:t>(kaitkan kegiatan ini dengan nilai-nilai</w:t>
-            </w:r>
-            <w:r>
-              <w:rPr>
-                <w:rFonts w:ascii="ArialMT" w:hAnsi="ArialMT"/>
-                <w:color w:val="000000"/>
-                <w:sz w:val="20"/>
-                <w:szCs w:val="20"/>
-              </w:rPr>
-              <w:br/>
-            </w:r>
-            <w:r>
-              <w:rPr>
-                <w:rStyle w:val="fontstyle21"/>
-              </w:rPr>
-              <w:t>dasar PNS BerAKHLAK yang relevan,</w:t>
-            </w:r>
-            <w:r>
-              <w:rPr>
-                <w:rFonts w:ascii="ArialMT" w:hAnsi="ArialMT"/>
-                <w:color w:val="000000"/>
-                <w:sz w:val="20"/>
-                <w:szCs w:val="20"/>
-              </w:rPr>
-              <w:br/>
-            </w:r>
-            <w:r>
-              <w:rPr>
-                <w:rStyle w:val="fontstyle01"/>
-              </w:rPr>
-              <w:t>minimal 3 nilai</w:t>
-            </w:r>
-            <w:r>
-              <w:rPr>
-                <w:rStyle w:val="fontstyle21"/>
-              </w:rPr>
-              <w:t>)</w:t>
-            </w:r>
-          </w:p>
-        </w:tc>
-        <w:tc>
-          <w:tcPr>
-            <w:tcW w:w="2592" w:type="dxa"/>
-          </w:tcPr>
-          <w:p>
-            <w:pPr>
-              <w:spacing w:after="0" w:line="240" w:lineRule="auto"/>
-              <w:rPr>
-                <w:rFonts w:eastAsia="Times New Roman"/>
-                <w:sz w:val="24"/>
-                <w:szCs w:val="24"/>
-                <w:lang w:val="sv-SE"/>
-              </w:rPr>
-            </w:pPr>
-            <w:r>
-              <w:rPr>
-                <w:rStyle w:val="fontstyle01"/>
-              </w:rPr>
-              <w:t>AGENDA III</w:t>
-            </w:r>
-            <w:r>
-              <w:rPr>
-                <w:rFonts w:ascii="Arial-BoldMT" w:hAnsi="Arial-BoldMT"/>
-                <w:b/>
-                <w:bCs/>
-                <w:color w:val="000000"/>
-                <w:sz w:val="20"/>
-                <w:szCs w:val="20"/>
-              </w:rPr>
-              <w:br/>
-            </w:r>
-            <w:r>
-              <w:rPr>
-                <w:rStyle w:val="fontstyle21"/>
-              </w:rPr>
-              <w:t>(kaitan kegiatan ini</w:t>
-            </w:r>
-            <w:r>
-              <w:rPr>
-                <w:rStyle w:val="fontstyle21"/>
-              </w:rPr>
-              <w:t xml:space="preserve"> </w:t>
-            </w:r>
-            <w:r>
-              <w:rPr>
-                <w:rStyle w:val="fontstyle21"/>
-              </w:rPr>
-              <w:t>dengan Kedudukan</w:t>
-            </w:r>
-            <w:r>
-              <w:rPr>
-                <w:rStyle w:val="fontstyle21"/>
-              </w:rPr>
-              <w:t xml:space="preserve"> </w:t>
-            </w:r>
-            <w:r>
-              <w:rPr>
-                <w:rStyle w:val="fontstyle21"/>
-              </w:rPr>
-              <w:t>dan Peran PNS</w:t>
-            </w:r>
-            <w:r>
-              <w:rPr>
-                <w:rStyle w:val="fontstyle21"/>
-              </w:rPr>
-              <w:t xml:space="preserve"> </w:t>
-            </w:r>
-            <w:r>
-              <w:rPr>
-                <w:rStyle w:val="fontstyle21"/>
-              </w:rPr>
-              <w:t>untuk mendukung</w:t>
-            </w:r>
-            <w:r>
-              <w:rPr>
-                <w:rStyle w:val="fontstyle21"/>
-              </w:rPr>
-              <w:t xml:space="preserve"> </w:t>
-            </w:r>
-            <w:r>
-              <w:rPr>
-                <w:rStyle w:val="fontstyle21"/>
-              </w:rPr>
-              <w:t xml:space="preserve">terwujudnya </w:t>
-            </w:r>
-            <w:r>
-              <w:rPr>
-                <w:rStyle w:val="fontstyle31"/>
-              </w:rPr>
-              <w:t>smart</w:t>
-            </w:r>
-            <w:r>
-              <w:rPr>
-                <w:rStyle w:val="fontstyle31"/>
-              </w:rPr>
-              <w:t xml:space="preserve"> </w:t>
-            </w:r>
-            <w:r>
-              <w:rPr>
-                <w:rStyle w:val="fontstyle31"/>
-              </w:rPr>
-              <w:t xml:space="preserve">governance </w:t>
-            </w:r>
-            <w:r>
-              <w:rPr>
-                <w:rStyle w:val="fontstyle21"/>
-              </w:rPr>
-              <w:t>yaitu</w:t>
-            </w:r>
-            <w:r>
-              <w:rPr>
-                <w:rStyle w:val="fontstyle21"/>
-              </w:rPr>
-              <w:t xml:space="preserve"> </w:t>
-            </w:r>
-            <w:r>
-              <w:rPr>
-                <w:rStyle w:val="fontstyle01"/>
-              </w:rPr>
-              <w:t>Manajemen</w:t>
-            </w:r>
-            <w:r>
-              <w:rPr>
-                <w:rStyle w:val="fontstyle01"/>
-              </w:rPr>
-              <w:t xml:space="preserve"> </w:t>
-            </w:r>
-            <w:r>
-              <w:rPr>
-                <w:rStyle w:val="fontstyle01"/>
-              </w:rPr>
-              <w:t>ASN/Smart ASN).</w:t>
-            </w:r>
-          </w:p>
-        </w:tc>
-        <w:tc>
-          <w:tcPr>
-            <w:tcW w:w="0" w:type="auto"/>
-          </w:tcPr>
-          <w:p>
-            <w:pPr>
-              <w:spacing w:after="0" w:line="240" w:lineRule="auto"/>
-              <w:rPr>
-                <w:rFonts w:eastAsia="Times New Roman"/>
-                <w:sz w:val="24"/>
-                <w:szCs w:val="24"/>
-                <w:lang w:val="en-ID"/>
-              </w:rPr>
-            </w:pPr>
-            <w:r>
-              <w:rPr>
-                <w:rStyle w:val="fontstyle01"/>
-              </w:rPr>
-              <w:t>Koordinasi dan</w:t>
-            </w:r>
-            <w:r>
-              <w:rPr>
-                <w:rFonts w:ascii="ArialMT" w:hAnsi="ArialMT"/>
-                <w:color w:val="000000"/>
-                <w:sz w:val="20"/>
-                <w:szCs w:val="20"/>
-              </w:rPr>
-              <w:br/>
-            </w:r>
-            <w:r>
-              <w:rPr>
-                <w:rStyle w:val="fontstyle01"/>
-              </w:rPr>
-              <w:t>kolaborasi</w:t>
-            </w:r>
-          </w:p>
-        </w:tc>
-        <w:tc>
-          <w:tcPr>
-            <w:tcW w:w="0" w:type="auto"/>
-          </w:tcPr>
-          <w:p>
-            <w:pPr>
-              <w:spacing w:after="0" w:line="240" w:lineRule="auto"/>
-              <w:rPr>
-                <w:rStyle w:val="fontstyle21"/>
-              </w:rPr>
-            </w:pPr>
-            <w:r>
-              <w:rPr>
-                <w:rStyle w:val="fontstyle01"/>
-              </w:rPr>
-              <w:t>(uraikan proses yang</w:t>
-            </w:r>
-            <w:r>
-              <w:rPr>
-                <w:rStyle w:val="fontstyle01"/>
-              </w:rPr>
-              <w:t xml:space="preserve"> </w:t>
-            </w:r>
-            <w:r>
-              <w:rPr>
-                <w:rStyle w:val="fontstyle01"/>
-              </w:rPr>
-              <w:t>dilakukan guna</w:t>
-            </w:r>
-            <w:r>
-              <w:rPr>
-                <w:rStyle w:val="fontstyle01"/>
-              </w:rPr>
-              <w:t xml:space="preserve"> </w:t>
-            </w:r>
-            <w:r>
-              <w:rPr>
-                <w:rStyle w:val="fontstyle01"/>
-              </w:rPr>
-              <w:t>mewujudkan dari</w:t>
-            </w:r>
-            <w:r>
-              <w:rPr>
-                <w:rStyle w:val="fontstyle01"/>
-              </w:rPr>
-              <w:t xml:space="preserve"> </w:t>
-            </w:r>
-            <w:r>
-              <w:rPr>
-                <w:rStyle w:val="fontstyle01"/>
-              </w:rPr>
-              <w:t>kegiatan yang dipilih</w:t>
-            </w:r>
-            <w:r>
-              <w:rPr>
-                <w:rStyle w:val="fontstyle01"/>
-              </w:rPr>
-              <w:t xml:space="preserve"> </w:t>
-            </w:r>
-            <w:r>
-              <w:rPr>
-                <w:rStyle w:val="fontstyle01"/>
-              </w:rPr>
-              <w:t>sebagai rencana aksi dan</w:t>
-            </w:r>
-            <w:r>
-              <w:rPr>
-                <w:rStyle w:val="fontstyle01"/>
-              </w:rPr>
-              <w:t xml:space="preserve"> </w:t>
-            </w:r>
-            <w:r>
-              <w:rPr>
-                <w:rStyle w:val="fontstyle01"/>
-              </w:rPr>
-              <w:t>harapan</w:t>
-            </w:r>
-            <w:r>
-              <w:rPr>
-                <w:rStyle w:val="fontstyle01"/>
-              </w:rPr>
-              <w:t xml:space="preserve"> </w:t>
-            </w:r>
-            <w:r>
-              <w:rPr>
-                <w:rStyle w:val="fontstyle01"/>
-              </w:rPr>
-              <w:t>kedepan yang diinginkan dari perwujudan hasil kegiatan</w:t>
-            </w:r>
-            <w:r>
-              <w:rPr>
-                <w:rStyle w:val="fontstyle01"/>
-              </w:rPr>
-              <w:t xml:space="preserve"> </w:t>
-            </w:r>
-            <w:r>
-              <w:rPr>
-                <w:rStyle w:val="fontstyle01"/>
-              </w:rPr>
-              <w:t>tersebut)</w:t>
-            </w:r>
-            <w:r>
-              <w:rPr>
-                <w:rFonts w:ascii="ArialMT" w:hAnsi="ArialMT"/>
-                <w:color w:val="000000"/>
-                <w:sz w:val="20"/>
-                <w:szCs w:val="20"/>
-              </w:rPr>
-              <w:br/>
-            </w:r>
-          </w:p>
-          <w:p>
-            <w:pPr>
-              <w:spacing w:after="0" w:line="240" w:lineRule="auto"/>
-              <w:rPr>
-                <w:rFonts w:eastAsia="Times New Roman"/>
-                <w:sz w:val="24"/>
-                <w:szCs w:val="24"/>
-                <w:lang w:val="sv-SE"/>
-              </w:rPr>
-            </w:pPr>
-            <w:r>
-              <w:rPr>
-                <w:rStyle w:val="fontstyle21"/>
-              </w:rPr>
-              <w:t xml:space="preserve">Output: </w:t>
-            </w:r>
-            <w:r>
-              <w:rPr>
-                <w:rStyle w:val="fontstyle01"/>
-              </w:rPr>
-              <w:t>(sebutkan output/hasil</w:t>
-            </w:r>
-            <w:r>
-              <w:rPr>
-                <w:rStyle w:val="fontstyle01"/>
-              </w:rPr>
-              <w:t xml:space="preserve"> </w:t>
-            </w:r>
-            <w:r>
-              <w:rPr>
-                <w:rStyle w:val="fontstyle01"/>
-              </w:rPr>
-              <w:t>yang diharapkan dari</w:t>
-            </w:r>
-            <w:r>
-              <w:rPr>
-                <w:rStyle w:val="fontstyle01"/>
-              </w:rPr>
-              <w:t xml:space="preserve"> </w:t>
-            </w:r>
-            <w:r>
-              <w:rPr>
-                <w:rStyle w:val="fontstyle01"/>
-              </w:rPr>
-              <w:t>kegiatan tersebut).</w:t>
-            </w:r>
-          </w:p>
-        </w:tc>
-      </w:tr>
-      <w:tr>
-        <w:tc>
-          <w:tcPr>
-            <w:tcW w:w="0" w:type="auto"/>
-          </w:tcPr>
-          <w:p/>
-        </w:tc>
-        <w:tc>
-          <w:tcPr>
-            <w:tcW w:w="0" w:type="auto"/>
-          </w:tcPr>
-          <w:p>
-            <w:pPr>
-              <w:spacing w:after="0" w:line="240" w:lineRule="auto"/>
-              <w:rPr>
-                <w:rStyle w:val="fontstyle01"/>
-              </w:rPr>
-            </w:pPr>
-          </w:p>
-        </w:tc>
-        <w:tc>
-          <w:tcPr>
-            <w:tcW w:w="2655" w:type="dxa"/>
-          </w:tcPr>
-          <w:p>
-            <w:pPr>
-              <w:spacing w:after="0" w:line="240" w:lineRule="auto"/>
-              <w:rPr>
-                <w:rStyle w:val="fontstyle01"/>
-              </w:rPr>
-            </w:pPr>
-          </w:p>
-        </w:tc>
-        <w:tc>
-          <w:tcPr>
-            <w:tcW w:w="2592" w:type="dxa"/>
-          </w:tcPr>
-          <w:p>
-            <w:pPr>
-              <w:spacing w:after="0" w:line="240" w:lineRule="auto"/>
-              <w:rPr>
-                <w:rStyle w:val="fontstyle01"/>
-              </w:rPr>
-            </w:pPr>
-          </w:p>
-        </w:tc>
-        <w:tc>
-          <w:tcPr>
-            <w:tcW w:w="0" w:type="auto"/>
-          </w:tcPr>
-          <w:p>
-            <w:pPr>
-              <w:spacing w:after="0" w:line="240" w:lineRule="auto"/>
-              <w:rPr>
-                <w:rStyle w:val="fontstyle01"/>
-              </w:rPr>
-            </w:pPr>
-          </w:p>
-        </w:tc>
-        <w:tc>
-          <w:tcPr>
-            <w:tcW w:w="0" w:type="auto"/>
-          </w:tcPr>
-          <w:p>
-            <w:pPr>
-              <w:spacing w:after="0" w:line="240" w:lineRule="auto"/>
-              <w:rPr>
-                <w:rStyle w:val="fontstyle01"/>
-              </w:rPr>
-            </w:pPr>
+              <w:rPr>
+                <w:rFonts w:ascii="Arial" w:hAnsi="Arial" w:cs="Arial"/>
+                <w:sz w:val="24"/>
+                <w:szCs w:val="24"/>
+                <w:lang w:val="sv-SE"/>
+              </w:rPr>
+            </w:pPr>
+          </w:p>
+          <w:p>
+            <w:pPr>
+              <w:jc w:val="center"/>
+              <w:rPr>
+                <w:rFonts w:ascii="Arial" w:hAnsi="Arial" w:cs="Arial"/>
+                <w:sz w:val="24"/>
+                <w:szCs w:val="24"/>
+                <w:lang w:val="sv-SE"/>
+              </w:rPr>
+            </w:pPr>
+          </w:p>
+          <w:p>
+            <w:pPr>
+              <w:jc w:val="center"/>
+              <w:rPr>
+                <w:rFonts w:ascii="Arial" w:hAnsi="Arial" w:cs="Arial"/>
+                <w:sz w:val="24"/>
+                <w:szCs w:val="24"/>
+                <w:lang w:val="sv-SE"/>
+              </w:rPr>
+            </w:pPr>
+            <w:r>
+              <w:rPr>
+                <w:rFonts w:ascii="Arial" w:hAnsi="Arial" w:cs="Arial"/>
+                <w:sz w:val="24"/>
+                <w:szCs w:val="24"/>
+                <w:lang w:val="sv-SE"/>
+              </w:rPr>
+              <w:t>Bancar Anggono Farros Santosa</w:t>
+            </w:r>
+            <w:r>
+              <w:rPr>
+                <w:rFonts w:ascii="Arial" w:hAnsi="Arial" w:cs="Arial"/>
+                <w:sz w:val="24"/>
+                <w:szCs w:val="24"/>
+                <w:lang w:val="sv-SE"/>
+              </w:rPr>
+              <w:t>, A.Md.</w:t>
+            </w:r>
+            <w:r>
+              <w:rPr>
+                <w:rFonts w:ascii="Arial" w:hAnsi="Arial" w:cs="Arial"/>
+                <w:sz w:val="24"/>
+                <w:szCs w:val="24"/>
+                <w:lang w:val="sv-SE"/>
+              </w:rPr>
+              <w:t>Kom.</w:t>
+            </w:r>
+          </w:p>
+          <w:p>
+            <w:pPr>
+              <w:jc w:val="center"/>
+              <w:rPr>
+                <w:rFonts w:ascii="Arial" w:hAnsi="Arial" w:cs="Arial"/>
+                <w:sz w:val="24"/>
+                <w:szCs w:val="24"/>
+              </w:rPr>
+            </w:pPr>
+            <w:r>
+              <w:rPr>
+                <w:rFonts w:ascii="Arial" w:hAnsi="Arial" w:cs="Arial"/>
+                <w:sz w:val="24"/>
+                <w:szCs w:val="24"/>
+              </w:rPr>
+              <w:t>NIP</w:t>
+            </w:r>
+            <w:r>
+              <w:rPr>
+                <w:rFonts w:ascii="Arial" w:hAnsi="Arial" w:cs="Arial"/>
+                <w:sz w:val="24"/>
+                <w:szCs w:val="24"/>
+              </w:rPr>
+              <w:t xml:space="preserve"> 200206252025061002</w:t>
+            </w:r>
           </w:p>
         </w:tc>
       </w:tr>
     </w:tbl>
-    <w:p/>
+    <w:p>
+      <w:pPr>
+        <w:rPr>
+          <w:rFonts w:ascii="Arial" w:hAnsi="Arial" w:cs="Arial"/>
+          <w:sz w:val="24"/>
+          <w:szCs w:val="24"/>
+        </w:rPr>
+      </w:pPr>
+    </w:p>
+    <w:p>
+      <w:pPr>
+        <w:rPr>
+          <w:rFonts w:ascii="Arial" w:hAnsi="Arial" w:cs="Arial"/>
+          <w:sz w:val="24"/>
+          <w:szCs w:val="24"/>
+        </w:rPr>
+      </w:pPr>
+    </w:p>
     <w:sectPr>
       <w:pgSz w:w="16838" w:h="11906" w:orient="landscape"/>
       <w:pgMar w:top="1440" w:right="1440" w:bottom="1440" w:left="1440" w:header="708" w:footer="708" w:gutter="0"/>
@@ -1505,7 +3212,7 @@
     <w:lsdException w:name="Table Web 2" w:semiHidden="1" w:unhideWhenUsed="1"/>
     <w:lsdException w:name="Table Web 3" w:semiHidden="1" w:unhideWhenUsed="1"/>
     <w:lsdException w:name="Balloon Text" w:semiHidden="1" w:unhideWhenUsed="1"/>
-    <w:lsdException w:name="Table Grid" w:uiPriority="0"/>
+    <w:lsdException w:name="Table Grid" w:uiPriority="39"/>
     <w:lsdException w:name="Table Theme" w:semiHidden="1" w:unhideWhenUsed="1"/>
     <w:lsdException w:name="Placeholder Text" w:semiHidden="1"/>
     <w:lsdException w:name="No Spacing" w:uiPriority="1" w:qFormat="1"/>
@@ -1946,7 +3653,6 @@
   <w:style w:type="character" w:default="1" w:styleId="DefaultParagraphFont">
     <w:name w:val="Default Paragraph Font"/>
     <w:uiPriority w:val="1"/>
-    <w:semiHidden/>
     <w:unhideWhenUsed/>
   </w:style>
   <w:style w:type="table" w:default="1" w:styleId="TableNormal">
@@ -2265,6 +3971,7 @@
   <w:style w:type="table" w:styleId="TableGrid">
     <w:name w:val="Table Grid"/>
     <w:basedOn w:val="TableNormal"/>
+    <w:uiPriority w:val="39"/>
     <w:rsid w:val="00103D8C"/>
     <w:pPr>
       <w:spacing w:after="0" w:line="240" w:lineRule="auto"/>
@@ -2340,6 +4047,25 @@
       <w:sz w:val="20"/>
       <w:szCs w:val="20"/>
     </w:rPr>
+  </w:style>
+  <w:style w:type="table" w:customStyle="1" w:styleId="TableGrid0">
+    <w:name w:val="TableGrid"/>
+    <w:rsid w:val="009340E9"/>
+    <w:pPr>
+      <w:spacing w:after="0" w:line="240" w:lineRule="auto"/>
+    </w:pPr>
+    <w:rPr>
+      <w:rFonts w:eastAsiaTheme="minorEastAsia"/>
+      <w:lang w:eastAsia="en-ID"/>
+    </w:rPr>
+    <w:tblPr>
+      <w:tblCellMar>
+        <w:top w:w="0" w:type="dxa"/>
+        <w:left w:w="0" w:type="dxa"/>
+        <w:bottom w:w="0" w:type="dxa"/>
+        <w:right w:w="0" w:type="dxa"/>
+      </w:tblCellMar>
+    </w:tblPr>
   </w:style>
 </w:styles>
 </file>

</xml_diff>